<commit_message>
Adding the Jupyter Notebook Files for Assignment
</commit_message>
<xml_diff>
--- a/assignment-test-prompts.docx
+++ b/assignment-test-prompts.docx
@@ -21,6 +21,35 @@
         <w:t>Prompt Scoring Agent Test Prompts</w:t>
       </w:r>
     </w:p>
+    <w:p>
+      <w:pPr>
+        <w:rPr>
+          <w:b/>
+          <w:bCs/>
+          <w:sz w:val="44"/>
+          <w:szCs w:val="44"/>
+        </w:rPr>
+      </w:pPr>
+    </w:p>
+    <w:p>
+      <w:pPr>
+        <w:rPr>
+          <w:b/>
+          <w:bCs/>
+          <w:sz w:val="44"/>
+          <w:szCs w:val="44"/>
+        </w:rPr>
+      </w:pPr>
+      <w:r>
+        <w:rPr>
+          <w:b/>
+          <w:bCs/>
+          <w:sz w:val="44"/>
+          <w:szCs w:val="44"/>
+        </w:rPr>
+        <w:t>Input</w:t>
+      </w:r>
+    </w:p>
     <w:p/>
     <w:p>
       <w:pPr>
@@ -113,6 +142,266 @@
     <w:p/>
     <w:p>
       <w:pPr>
+        <w:rPr>
+          <w:b/>
+          <w:bCs/>
+          <w:sz w:val="44"/>
+          <w:szCs w:val="44"/>
+        </w:rPr>
+      </w:pPr>
+      <w:r>
+        <w:rPr>
+          <w:b/>
+          <w:bCs/>
+          <w:sz w:val="44"/>
+          <w:szCs w:val="44"/>
+        </w:rPr>
+        <w:t>Ou</w:t>
+      </w:r>
+      <w:r>
+        <w:rPr>
+          <w:b/>
+          <w:bCs/>
+          <w:sz w:val="44"/>
+          <w:szCs w:val="44"/>
+        </w:rPr>
+        <w:t>t</w:t>
+      </w:r>
+      <w:r>
+        <w:rPr>
+          <w:b/>
+          <w:bCs/>
+          <w:sz w:val="44"/>
+          <w:szCs w:val="44"/>
+        </w:rPr>
+        <w:t>put</w:t>
+      </w:r>
+    </w:p>
+    <w:p/>
+    <w:p>
+      <w:r>
+        <w:t>Here's the evaluation of your prompt:</w:t>
+      </w:r>
+    </w:p>
+    <w:p/>
+    <w:p>
+      <w:r>
+        <w:t>**Final Score: 5.6 / 10**</w:t>
+      </w:r>
+    </w:p>
+    <w:p/>
+    <w:p>
+      <w:r>
+        <w:t xml:space="preserve">**Scores for each Quality </w:t>
+      </w:r>
+      <w:proofErr w:type="gramStart"/>
+      <w:r>
+        <w:t>Criterion:*</w:t>
+      </w:r>
+      <w:proofErr w:type="gramEnd"/>
+      <w:r>
+        <w:t>*</w:t>
+      </w:r>
+    </w:p>
+    <w:p/>
+    <w:p>
+      <w:r>
+        <w:t>1.  **Clarity of prompt: 8/10**</w:t>
+      </w:r>
+    </w:p>
+    <w:p>
+      <w:r>
+        <w:t xml:space="preserve">    *   **</w:t>
+      </w:r>
+      <w:proofErr w:type="gramStart"/>
+      <w:r>
+        <w:t>Explanation:*</w:t>
+      </w:r>
+      <w:proofErr w:type="gramEnd"/>
+      <w:r>
+        <w:t xml:space="preserve">* The prompt is generally easy to understand. The role is clear, and the core task (planning an itinerary based on destination and "number of </w:t>
+      </w:r>
+      <w:proofErr w:type="gramStart"/>
+      <w:r>
+        <w:t>vacation</w:t>
+      </w:r>
+      <w:proofErr w:type="gramEnd"/>
+      <w:r>
+        <w:t xml:space="preserve">") is evident. However, "number of </w:t>
+      </w:r>
+      <w:proofErr w:type="gramStart"/>
+      <w:r>
+        <w:t>vacation</w:t>
+      </w:r>
+      <w:proofErr w:type="gramEnd"/>
+      <w:r>
+        <w:t>" is slightly ambiguous; it's likely meant to be "number of days" or "duration of the trip."</w:t>
+      </w:r>
+    </w:p>
+    <w:p>
+      <w:r>
+        <w:t>2.  **Specificity/Details: 3/10**</w:t>
+      </w:r>
+    </w:p>
+    <w:p>
+      <w:r>
+        <w:t xml:space="preserve">    *   **</w:t>
+      </w:r>
+      <w:proofErr w:type="gramStart"/>
+      <w:r>
+        <w:t>Explanation:*</w:t>
+      </w:r>
+      <w:proofErr w:type="gramEnd"/>
+      <w:r>
+        <w:t xml:space="preserve">* While it specifies "destination in India" and a duration input, it lacks crucial details. It doesn't mention </w:t>
+      </w:r>
+      <w:proofErr w:type="spellStart"/>
+      <w:r>
+        <w:t>traveler</w:t>
+      </w:r>
+      <w:proofErr w:type="spellEnd"/>
+      <w:r>
+        <w:t xml:space="preserve"> preferences (e.g., budget, interests like adventure/culture/relaxation, solo/family/couple), preferred travel style, or specific inclusions/exclusions for the itinerary.</w:t>
+      </w:r>
+    </w:p>
+    <w:p>
+      <w:r>
+        <w:t>3.  **Context: 5/10**</w:t>
+      </w:r>
+    </w:p>
+    <w:p>
+      <w:r>
+        <w:lastRenderedPageBreak/>
+        <w:t xml:space="preserve">    *   **</w:t>
+      </w:r>
+      <w:proofErr w:type="gramStart"/>
+      <w:r>
+        <w:t>Explanation:*</w:t>
+      </w:r>
+      <w:proofErr w:type="gramEnd"/>
+      <w:r>
+        <w:t>* The prompt provides context by assigning the role of a "Travel agent who plans vacations to destination in India." This sets the scene. However, it lacks context about the *user's* specific needs or the purpose of this particular itinerary (e.g., a honeymoon, a budget backpacking trip, a luxury family vacation).</w:t>
+      </w:r>
+    </w:p>
+    <w:p>
+      <w:r>
+        <w:t>4.  **Output Format and constraints: 2/10**</w:t>
+      </w:r>
+    </w:p>
+    <w:p>
+      <w:r>
+        <w:t xml:space="preserve">    *   **</w:t>
+      </w:r>
+      <w:proofErr w:type="gramStart"/>
+      <w:r>
+        <w:t>Explanation:*</w:t>
+      </w:r>
+      <w:proofErr w:type="gramEnd"/>
+      <w:r>
+        <w:t>* The prompt asks to "plan the itinerary," which implies a structured output. However, it doesn't specify *how* the itinerary should be presented (e.g., daily breakdown, bullet points, table), what tone to use, or what level of detail (e.g., include hotels, transport, meal suggestions). No length constraints are given.</w:t>
+      </w:r>
+    </w:p>
+    <w:p>
+      <w:r>
+        <w:t>5.  **Confirm if a prompt assigns a specific role: 10/10**</w:t>
+      </w:r>
+    </w:p>
+    <w:p>
+      <w:r>
+        <w:t xml:space="preserve">    *   **</w:t>
+      </w:r>
+      <w:proofErr w:type="gramStart"/>
+      <w:r>
+        <w:t>Explanation:*</w:t>
+      </w:r>
+      <w:proofErr w:type="gramEnd"/>
+      <w:r>
+        <w:t>* The prompt clearly assigns a specific role: "You are Travel agent who plans vacations to destination in India."</w:t>
+      </w:r>
+    </w:p>
+    <w:p/>
+    <w:p>
+      <w:r>
+        <w:t xml:space="preserve">**Suggestions for improving the </w:t>
+      </w:r>
+      <w:proofErr w:type="gramStart"/>
+      <w:r>
+        <w:t>prompt:*</w:t>
+      </w:r>
+      <w:proofErr w:type="gramEnd"/>
+      <w:r>
+        <w:t>*</w:t>
+      </w:r>
+    </w:p>
+    <w:p/>
+    <w:p>
+      <w:r>
+        <w:t xml:space="preserve">1.  **Clarify Input and Add Traveler </w:t>
+      </w:r>
+      <w:proofErr w:type="gramStart"/>
+      <w:r>
+        <w:t>Preferences:*</w:t>
+      </w:r>
+      <w:proofErr w:type="gramEnd"/>
+      <w:r>
+        <w:t xml:space="preserve">* Instead of "number of </w:t>
+      </w:r>
+      <w:proofErr w:type="gramStart"/>
+      <w:r>
+        <w:t>vacation</w:t>
+      </w:r>
+      <w:proofErr w:type="gramEnd"/>
+      <w:r>
+        <w:t xml:space="preserve">," specify "number of days" or "duration of the trip." Also, ask for details about the </w:t>
+      </w:r>
+      <w:proofErr w:type="spellStart"/>
+      <w:r>
+        <w:t>traveler</w:t>
+      </w:r>
+      <w:proofErr w:type="spellEnd"/>
+      <w:r>
+        <w:t>, such as "What is your budget (e.g., luxury, mid-range, budget-friendly)? What are your interests (e.g., adventure, culture, relaxation, food)? Are you traveling solo, with family, or as a couple?"</w:t>
+      </w:r>
+    </w:p>
+    <w:p>
+      <w:r>
+        <w:t xml:space="preserve">2.  **Specify Output Format and </w:t>
+      </w:r>
+      <w:proofErr w:type="gramStart"/>
+      <w:r>
+        <w:t>Content:*</w:t>
+      </w:r>
+      <w:proofErr w:type="gramEnd"/>
+      <w:r>
+        <w:t>* Define how you want the itinerary presented. For example, "Provide a day-by-day itinerary in bullet points, including suggested activities, places to visit, and recommended local cuisine. Also, suggest a suitable mode of transport between locations."</w:t>
+      </w:r>
+    </w:p>
+    <w:p>
+      <w:r>
+        <w:t xml:space="preserve">3.  **Add Constraints and Desired </w:t>
+      </w:r>
+      <w:proofErr w:type="gramStart"/>
+      <w:r>
+        <w:t>Inclusions:*</w:t>
+      </w:r>
+      <w:proofErr w:type="gramEnd"/>
+      <w:r>
+        <w:t>* Mention any specific constraints or desired inclusions. For instance, "Ensure the itinerary is suitable for a family with young children," or "Include options for sustainable travel," or "Suggest unique off-the-beaten-path experiences."</w:t>
+      </w:r>
+    </w:p>
+    <w:p/>
+    <w:p/>
+    <w:p/>
+    <w:p/>
+    <w:p/>
+    <w:p/>
+    <w:p/>
+    <w:p/>
+    <w:p/>
+    <w:p/>
+    <w:p/>
+    <w:p>
+      <w:pPr>
         <w:pStyle w:val="ListParagraph"/>
         <w:numPr>
           <w:ilvl w:val="0"/>
@@ -120,6 +409,7 @@
         </w:numPr>
       </w:pPr>
       <w:r>
+        <w:lastRenderedPageBreak/>
         <w:t xml:space="preserve">You are agent named Data who is an expert in Star Trek Universe. You answer question on all the seasons on Star </w:t>
       </w:r>
       <w:r>
@@ -183,6 +473,186 @@
         <w:t>Which alien race the character belongs to</w:t>
       </w:r>
     </w:p>
+    <w:p/>
+    <w:p>
+      <w:r>
+        <w:t>Output</w:t>
+      </w:r>
+    </w:p>
+    <w:p/>
+    <w:p>
+      <w:r>
+        <w:t>Here's the evaluation of your prompt:</w:t>
+      </w:r>
+    </w:p>
+    <w:p/>
+    <w:p>
+      <w:r>
+        <w:t>**Final Score: 8.2 / 10**</w:t>
+      </w:r>
+    </w:p>
+    <w:p/>
+    <w:p>
+      <w:r>
+        <w:t xml:space="preserve">**Scores for each Quality </w:t>
+      </w:r>
+      <w:proofErr w:type="gramStart"/>
+      <w:r>
+        <w:t>Criterion:*</w:t>
+      </w:r>
+      <w:proofErr w:type="gramEnd"/>
+      <w:r>
+        <w:t>*</w:t>
+      </w:r>
+    </w:p>
+    <w:p/>
+    <w:p>
+      <w:r>
+        <w:t>1.  **Clarity of prompt: 9/10**</w:t>
+      </w:r>
+    </w:p>
+    <w:p>
+      <w:r>
+        <w:t xml:space="preserve">    *   **</w:t>
+      </w:r>
+      <w:proofErr w:type="gramStart"/>
+      <w:r>
+        <w:t>Explanation:*</w:t>
+      </w:r>
+      <w:proofErr w:type="gramEnd"/>
+      <w:r>
+        <w:t>* The prompt is very clear and easy to understand. It explicitly states the role, the domain of expertise, the input, and the desired output elements.</w:t>
+      </w:r>
+    </w:p>
+    <w:p>
+      <w:r>
+        <w:t>2.  **Specificity/Details: 8/10**</w:t>
+      </w:r>
+    </w:p>
+    <w:p>
+      <w:r>
+        <w:t xml:space="preserve">    *   **</w:t>
+      </w:r>
+      <w:proofErr w:type="gramStart"/>
+      <w:r>
+        <w:t>Explanation:*</w:t>
+      </w:r>
+      <w:proofErr w:type="gramEnd"/>
+      <w:r>
+        <w:t>* The prompt provides good detail regarding the scope (all Star Trek seasons from Original to Academy) and the specific information points required for the output (season, biography, episode count, alien race). However, it could be slightly more specific about the *depth* of the biography or how to handle characters appearing in multiple series/seasons.</w:t>
+      </w:r>
+    </w:p>
+    <w:p>
+      <w:r>
+        <w:t>3.  **Context: 8/10**</w:t>
+      </w:r>
+    </w:p>
+    <w:p>
+      <w:r>
+        <w:t xml:space="preserve">    *   **</w:t>
+      </w:r>
+      <w:proofErr w:type="gramStart"/>
+      <w:r>
+        <w:t>Explanation:*</w:t>
+      </w:r>
+      <w:proofErr w:type="gramEnd"/>
+      <w:r>
+        <w:t>* The context is well-established by assigning the role of "Data, an expert in Star Trek Universe" and defining the scope of knowledge. The use case (answering character questions) is also clear. No specific audience or broader purpose is mentioned, but for this type of factual query, it's largely sufficient.</w:t>
+      </w:r>
+    </w:p>
+    <w:p>
+      <w:r>
+        <w:t>4.  **Output Format and constraints: 6/10**</w:t>
+      </w:r>
+    </w:p>
+    <w:p>
+      <w:r>
+        <w:t xml:space="preserve">    *   **</w:t>
+      </w:r>
+      <w:proofErr w:type="gramStart"/>
+      <w:r>
+        <w:t>Explanation:*</w:t>
+      </w:r>
+      <w:proofErr w:type="gramEnd"/>
+      <w:r>
+        <w:t>* While the *elements* of the output are clearly listed (a, b, c, d), the prompt does not specify the *format* (e.g., bullet points, a table, JSON, a conversational paragraph), the desired *tone*, or any *length constraints* for the biography or the overall response.</w:t>
+      </w:r>
+    </w:p>
+    <w:p>
+      <w:r>
+        <w:t>5.  **Confirm if a prompt assigns a specific role: 10/10**</w:t>
+      </w:r>
+    </w:p>
+    <w:p>
+      <w:r>
+        <w:t xml:space="preserve">    *   **</w:t>
+      </w:r>
+      <w:proofErr w:type="gramStart"/>
+      <w:r>
+        <w:t>Explanation:*</w:t>
+      </w:r>
+      <w:proofErr w:type="gramEnd"/>
+      <w:r>
+        <w:t>* The prompt explicitly assigns a clear and specific role: "You are agent named Data who is an expert in Star Trek Universe."</w:t>
+      </w:r>
+    </w:p>
+    <w:p/>
+    <w:p>
+      <w:r>
+        <w:lastRenderedPageBreak/>
+        <w:t xml:space="preserve">**Suggestions for improving the </w:t>
+      </w:r>
+      <w:proofErr w:type="gramStart"/>
+      <w:r>
+        <w:t>prompt:*</w:t>
+      </w:r>
+      <w:proofErr w:type="gramEnd"/>
+      <w:r>
+        <w:t>*</w:t>
+      </w:r>
+    </w:p>
+    <w:p/>
+    <w:p>
+      <w:r>
+        <w:t xml:space="preserve">1.  **Specify Output </w:t>
+      </w:r>
+      <w:proofErr w:type="gramStart"/>
+      <w:r>
+        <w:t>Format:*</w:t>
+      </w:r>
+      <w:proofErr w:type="gramEnd"/>
+      <w:r>
+        <w:t>* Clearly define how the output should be structured. For example, "The output should be presented as a bulleted list for each character, with the biography as a concise paragraph." or "Provide the output in a JSON format."</w:t>
+      </w:r>
+    </w:p>
+    <w:p>
+      <w:r>
+        <w:t xml:space="preserve">2.  **Refine Output </w:t>
+      </w:r>
+      <w:proofErr w:type="gramStart"/>
+      <w:r>
+        <w:t>Details:*</w:t>
+      </w:r>
+      <w:proofErr w:type="gramEnd"/>
+      <w:r>
+        <w:t>* Clarify the expected length/depth of the "character biography" (e.g., "a concise summary of their key roles and arcs," "a detailed overview"). Also, consider adding instructions for characters appearing in multiple series/seasons (e.g., "list all series/seasons they appear in") and how to handle human characters under "alien race" (e.g., "state 'Human' if applicable").</w:t>
+      </w:r>
+    </w:p>
+    <w:p>
+      <w:r>
+        <w:t xml:space="preserve">3.  **Add Error Handling/Edge </w:t>
+      </w:r>
+      <w:proofErr w:type="gramStart"/>
+      <w:r>
+        <w:t>Cases:*</w:t>
+      </w:r>
+      <w:proofErr w:type="gramEnd"/>
+      <w:r>
+        <w:t>* Instruct the agent on how to respond if a character is not found in the Star Trek universe or if the input is ambiguous. For example, "If the character is not found, politely inform the user and suggest checking the spelling."</w:t>
+      </w:r>
+    </w:p>
+    <w:p/>
+    <w:p/>
     <w:p/>
     <w:p>
       <w:pPr>
@@ -1177,7 +1647,6 @@
   <w:style w:type="character" w:default="1" w:styleId="DefaultParagraphFont">
     <w:name w:val="Default Paragraph Font"/>
     <w:uiPriority w:val="1"/>
-    <w:semiHidden/>
     <w:unhideWhenUsed/>
   </w:style>
   <w:style w:type="table" w:default="1" w:styleId="TableNormal">

</xml_diff>

<commit_message>
Updated the inputs and outputs
</commit_message>
<xml_diff>
--- a/assignment-test-prompts.docx
+++ b/assignment-test-prompts.docx
@@ -20,26 +20,44 @@
         </w:rPr>
         <w:t>Prompt Scoring Agent Test Prompts</w:t>
       </w:r>
-    </w:p>
-    <w:p>
-      <w:pPr>
-        <w:rPr>
-          <w:b/>
-          <w:bCs/>
-          <w:sz w:val="44"/>
-          <w:szCs w:val="44"/>
-        </w:rPr>
-      </w:pPr>
-    </w:p>
-    <w:p>
-      <w:pPr>
-        <w:rPr>
-          <w:b/>
-          <w:bCs/>
-          <w:sz w:val="44"/>
-          <w:szCs w:val="44"/>
-        </w:rPr>
-      </w:pPr>
+      <w:r>
+        <w:rPr>
+          <w:b/>
+          <w:bCs/>
+          <w:sz w:val="44"/>
+          <w:szCs w:val="44"/>
+        </w:rPr>
+        <w:t xml:space="preserve"> &amp; Ouputs</w:t>
+      </w:r>
+    </w:p>
+    <w:p>
+      <w:pPr>
+        <w:rPr>
+          <w:b/>
+          <w:bCs/>
+          <w:sz w:val="44"/>
+          <w:szCs w:val="44"/>
+        </w:rPr>
+      </w:pPr>
+    </w:p>
+    <w:p>
+      <w:pPr>
+        <w:rPr>
+          <w:b/>
+          <w:bCs/>
+          <w:sz w:val="44"/>
+          <w:szCs w:val="44"/>
+        </w:rPr>
+      </w:pPr>
+      <w:r>
+        <w:rPr>
+          <w:b/>
+          <w:bCs/>
+          <w:sz w:val="44"/>
+          <w:szCs w:val="44"/>
+        </w:rPr>
+        <w:t xml:space="preserve">Test1 - </w:t>
+      </w:r>
       <w:r>
         <w:rPr>
           <w:b/>
@@ -53,22 +71,33 @@
     <w:p/>
     <w:p>
       <w:pPr>
-        <w:pStyle w:val="ListParagraph"/>
-        <w:numPr>
-          <w:ilvl w:val="0"/>
-          <w:numId w:val="1"/>
-        </w:numPr>
-      </w:pPr>
-      <w:r>
+        <w:rPr>
+          <w:sz w:val="28"/>
+          <w:szCs w:val="28"/>
+        </w:rPr>
+      </w:pPr>
+      <w:r>
+        <w:rPr>
+          <w:sz w:val="28"/>
+          <w:szCs w:val="28"/>
+        </w:rPr>
         <w:t>You are a travel planner agent who plans travel specifically for couples and family. The user will provide the destination location and days for the vacation. The output should be in a user-friendly readable format with following sections</w:t>
       </w:r>
       <w:r>
+        <w:rPr>
+          <w:sz w:val="28"/>
+          <w:szCs w:val="28"/>
+        </w:rPr>
         <w:tab/>
       </w:r>
     </w:p>
     <w:p>
       <w:pPr>
         <w:pStyle w:val="ListParagraph"/>
+        <w:rPr>
+          <w:sz w:val="28"/>
+          <w:szCs w:val="28"/>
+        </w:rPr>
       </w:pPr>
     </w:p>
     <w:p>
@@ -78,16 +107,32 @@
           <w:ilvl w:val="0"/>
           <w:numId w:val="2"/>
         </w:numPr>
-      </w:pPr>
-      <w:r>
+        <w:rPr>
+          <w:sz w:val="28"/>
+          <w:szCs w:val="28"/>
+        </w:rPr>
+      </w:pPr>
+      <w:r>
+        <w:rPr>
+          <w:sz w:val="28"/>
+          <w:szCs w:val="28"/>
+        </w:rPr>
         <w:t xml:space="preserve">Hotel options which </w:t>
       </w:r>
       <w:proofErr w:type="gramStart"/>
       <w:r>
+        <w:rPr>
+          <w:sz w:val="28"/>
+          <w:szCs w:val="28"/>
+        </w:rPr>
         <w:t>has</w:t>
       </w:r>
       <w:proofErr w:type="gramEnd"/>
       <w:r>
+        <w:rPr>
+          <w:sz w:val="28"/>
+          <w:szCs w:val="28"/>
+        </w:rPr>
         <w:t xml:space="preserve"> both luxury and budget hotels</w:t>
       </w:r>
     </w:p>
@@ -98,8 +143,16 @@
           <w:ilvl w:val="0"/>
           <w:numId w:val="2"/>
         </w:numPr>
-      </w:pPr>
-      <w:r>
+        <w:rPr>
+          <w:sz w:val="28"/>
+          <w:szCs w:val="28"/>
+        </w:rPr>
+      </w:pPr>
+      <w:r>
+        <w:rPr>
+          <w:sz w:val="28"/>
+          <w:szCs w:val="28"/>
+        </w:rPr>
         <w:t>Places to visit in the destination location</w:t>
       </w:r>
     </w:p>
@@ -110,8 +163,16 @@
           <w:ilvl w:val="0"/>
           <w:numId w:val="2"/>
         </w:numPr>
-      </w:pPr>
-      <w:r>
+        <w:rPr>
+          <w:sz w:val="28"/>
+          <w:szCs w:val="28"/>
+        </w:rPr>
+      </w:pPr>
+      <w:r>
+        <w:rPr>
+          <w:sz w:val="28"/>
+          <w:szCs w:val="28"/>
+        </w:rPr>
         <w:t>Models to transport available for tourist hotspots</w:t>
       </w:r>
     </w:p>
@@ -122,8 +183,16 @@
           <w:ilvl w:val="0"/>
           <w:numId w:val="2"/>
         </w:numPr>
-      </w:pPr>
-      <w:r>
+        <w:rPr>
+          <w:sz w:val="28"/>
+          <w:szCs w:val="28"/>
+        </w:rPr>
+      </w:pPr>
+      <w:r>
+        <w:rPr>
+          <w:sz w:val="28"/>
+          <w:szCs w:val="28"/>
+        </w:rPr>
         <w:t>Information on things to do at each location</w:t>
       </w:r>
     </w:p>
@@ -134,8 +203,16 @@
           <w:ilvl w:val="0"/>
           <w:numId w:val="2"/>
         </w:numPr>
-      </w:pPr>
-      <w:r>
+        <w:rPr>
+          <w:sz w:val="28"/>
+          <w:szCs w:val="28"/>
+        </w:rPr>
+      </w:pPr>
+      <w:r>
+        <w:rPr>
+          <w:sz w:val="28"/>
+          <w:szCs w:val="28"/>
+        </w:rPr>
         <w:t>Plan for each day</w:t>
       </w:r>
     </w:p>
@@ -156,6 +233,15 @@
           <w:sz w:val="44"/>
           <w:szCs w:val="44"/>
         </w:rPr>
+        <w:t xml:space="preserve">Test1 - </w:t>
+      </w:r>
+      <w:r>
+        <w:rPr>
+          <w:b/>
+          <w:bCs/>
+          <w:sz w:val="44"/>
+          <w:szCs w:val="44"/>
+        </w:rPr>
         <w:t>Ou</w:t>
       </w:r>
       <w:r>
@@ -179,213 +265,507 @@
     </w:p>
     <w:p/>
     <w:p>
-      <w:r>
+      <w:pPr>
+        <w:rPr>
+          <w:sz w:val="28"/>
+          <w:szCs w:val="28"/>
+        </w:rPr>
+      </w:pPr>
+      <w:r>
+        <w:rPr>
+          <w:sz w:val="28"/>
+          <w:szCs w:val="28"/>
+        </w:rPr>
         <w:t>Here's the evaluation of your prompt:</w:t>
       </w:r>
     </w:p>
-    <w:p/>
-    <w:p>
-      <w:r>
+    <w:p>
+      <w:pPr>
+        <w:rPr>
+          <w:sz w:val="28"/>
+          <w:szCs w:val="28"/>
+        </w:rPr>
+      </w:pPr>
+    </w:p>
+    <w:p>
+      <w:pPr>
+        <w:rPr>
+          <w:sz w:val="28"/>
+          <w:szCs w:val="28"/>
+        </w:rPr>
+      </w:pPr>
+      <w:r>
+        <w:rPr>
+          <w:sz w:val="28"/>
+          <w:szCs w:val="28"/>
+        </w:rPr>
         <w:t>**Final Score: 5.6 / 10**</w:t>
       </w:r>
     </w:p>
-    <w:p/>
-    <w:p>
-      <w:r>
+    <w:p>
+      <w:pPr>
+        <w:rPr>
+          <w:sz w:val="28"/>
+          <w:szCs w:val="28"/>
+        </w:rPr>
+      </w:pPr>
+    </w:p>
+    <w:p>
+      <w:pPr>
+        <w:rPr>
+          <w:sz w:val="28"/>
+          <w:szCs w:val="28"/>
+        </w:rPr>
+      </w:pPr>
+      <w:r>
+        <w:rPr>
+          <w:sz w:val="28"/>
+          <w:szCs w:val="28"/>
+        </w:rPr>
         <w:t xml:space="preserve">**Scores for each Quality </w:t>
       </w:r>
       <w:proofErr w:type="gramStart"/>
       <w:r>
+        <w:rPr>
+          <w:sz w:val="28"/>
+          <w:szCs w:val="28"/>
+        </w:rPr>
         <w:t>Criterion:*</w:t>
       </w:r>
       <w:proofErr w:type="gramEnd"/>
       <w:r>
+        <w:rPr>
+          <w:sz w:val="28"/>
+          <w:szCs w:val="28"/>
+        </w:rPr>
         <w:t>*</w:t>
       </w:r>
     </w:p>
-    <w:p/>
-    <w:p>
-      <w:r>
+    <w:p>
+      <w:pPr>
+        <w:rPr>
+          <w:sz w:val="28"/>
+          <w:szCs w:val="28"/>
+        </w:rPr>
+      </w:pPr>
+    </w:p>
+    <w:p>
+      <w:pPr>
+        <w:rPr>
+          <w:sz w:val="28"/>
+          <w:szCs w:val="28"/>
+        </w:rPr>
+      </w:pPr>
+      <w:r>
+        <w:rPr>
+          <w:sz w:val="28"/>
+          <w:szCs w:val="28"/>
+        </w:rPr>
         <w:t>1.  **Clarity of prompt: 8/10**</w:t>
       </w:r>
     </w:p>
     <w:p>
-      <w:r>
+      <w:pPr>
+        <w:rPr>
+          <w:sz w:val="28"/>
+          <w:szCs w:val="28"/>
+        </w:rPr>
+      </w:pPr>
+      <w:r>
+        <w:rPr>
+          <w:sz w:val="28"/>
+          <w:szCs w:val="28"/>
+        </w:rPr>
         <w:t xml:space="preserve">    *   **</w:t>
       </w:r>
       <w:proofErr w:type="gramStart"/>
       <w:r>
+        <w:rPr>
+          <w:sz w:val="28"/>
+          <w:szCs w:val="28"/>
+        </w:rPr>
         <w:t>Explanation:*</w:t>
       </w:r>
       <w:proofErr w:type="gramEnd"/>
       <w:r>
+        <w:rPr>
+          <w:sz w:val="28"/>
+          <w:szCs w:val="28"/>
+        </w:rPr>
         <w:t xml:space="preserve">* The prompt is generally easy to understand. The role is clear, and the core task (planning an itinerary based on destination and "number of </w:t>
       </w:r>
       <w:proofErr w:type="gramStart"/>
       <w:r>
+        <w:rPr>
+          <w:sz w:val="28"/>
+          <w:szCs w:val="28"/>
+        </w:rPr>
         <w:t>vacation</w:t>
       </w:r>
       <w:proofErr w:type="gramEnd"/>
       <w:r>
+        <w:rPr>
+          <w:sz w:val="28"/>
+          <w:szCs w:val="28"/>
+        </w:rPr>
         <w:t xml:space="preserve">") is evident. However, "number of </w:t>
       </w:r>
       <w:proofErr w:type="gramStart"/>
       <w:r>
+        <w:rPr>
+          <w:sz w:val="28"/>
+          <w:szCs w:val="28"/>
+        </w:rPr>
         <w:t>vacation</w:t>
       </w:r>
       <w:proofErr w:type="gramEnd"/>
       <w:r>
+        <w:rPr>
+          <w:sz w:val="28"/>
+          <w:szCs w:val="28"/>
+        </w:rPr>
         <w:t>" is slightly ambiguous; it's likely meant to be "number of days" or "duration of the trip."</w:t>
       </w:r>
     </w:p>
     <w:p>
-      <w:r>
+      <w:pPr>
+        <w:rPr>
+          <w:sz w:val="28"/>
+          <w:szCs w:val="28"/>
+        </w:rPr>
+      </w:pPr>
+      <w:r>
+        <w:rPr>
+          <w:sz w:val="28"/>
+          <w:szCs w:val="28"/>
+        </w:rPr>
+        <w:lastRenderedPageBreak/>
         <w:t>2.  **Specificity/Details: 3/10**</w:t>
       </w:r>
     </w:p>
     <w:p>
-      <w:r>
+      <w:pPr>
+        <w:rPr>
+          <w:sz w:val="28"/>
+          <w:szCs w:val="28"/>
+        </w:rPr>
+      </w:pPr>
+      <w:r>
+        <w:rPr>
+          <w:sz w:val="28"/>
+          <w:szCs w:val="28"/>
+        </w:rPr>
         <w:t xml:space="preserve">    *   **</w:t>
       </w:r>
       <w:proofErr w:type="gramStart"/>
       <w:r>
+        <w:rPr>
+          <w:sz w:val="28"/>
+          <w:szCs w:val="28"/>
+        </w:rPr>
         <w:t>Explanation:*</w:t>
       </w:r>
       <w:proofErr w:type="gramEnd"/>
       <w:r>
-        <w:t xml:space="preserve">* While it specifies "destination in India" and a duration input, it lacks crucial details. It doesn't mention </w:t>
-      </w:r>
-      <w:proofErr w:type="spellStart"/>
-      <w:r>
-        <w:t>traveler</w:t>
-      </w:r>
-      <w:proofErr w:type="spellEnd"/>
-      <w:r>
-        <w:t xml:space="preserve"> preferences (e.g., budget, interests like adventure/culture/relaxation, solo/family/couple), preferred travel style, or specific inclusions/exclusions for the itinerary.</w:t>
-      </w:r>
-    </w:p>
-    <w:p>
-      <w:r>
+        <w:rPr>
+          <w:sz w:val="28"/>
+          <w:szCs w:val="28"/>
+        </w:rPr>
+        <w:t>* While it specifies "destination in India" and a duration input, it lacks crucial details. It doesn't mention traveler preferences (e.g., budget, interests like adventure/culture/relaxation, solo/family/couple), preferred travel style, or specific inclusions/exclusions for the itinerary.</w:t>
+      </w:r>
+    </w:p>
+    <w:p>
+      <w:pPr>
+        <w:rPr>
+          <w:sz w:val="28"/>
+          <w:szCs w:val="28"/>
+        </w:rPr>
+      </w:pPr>
+      <w:r>
+        <w:rPr>
+          <w:sz w:val="28"/>
+          <w:szCs w:val="28"/>
+        </w:rPr>
         <w:t>3.  **Context: 5/10**</w:t>
       </w:r>
     </w:p>
     <w:p>
-      <w:r>
+      <w:pPr>
+        <w:rPr>
+          <w:sz w:val="28"/>
+          <w:szCs w:val="28"/>
+        </w:rPr>
+      </w:pPr>
+      <w:r>
+        <w:rPr>
+          <w:sz w:val="28"/>
+          <w:szCs w:val="28"/>
+        </w:rPr>
+        <w:t xml:space="preserve">    *   **</w:t>
+      </w:r>
+      <w:proofErr w:type="gramStart"/>
+      <w:r>
+        <w:rPr>
+          <w:sz w:val="28"/>
+          <w:szCs w:val="28"/>
+        </w:rPr>
+        <w:t>Explanation:*</w:t>
+      </w:r>
+      <w:proofErr w:type="gramEnd"/>
+      <w:r>
+        <w:rPr>
+          <w:sz w:val="28"/>
+          <w:szCs w:val="28"/>
+        </w:rPr>
+        <w:t>* The prompt provides context by assigning the role of a "Travel agent who plans vacations to destination in India." This sets the scene. However, it lacks context about the *user's* specific needs or the purpose of this particular itinerary (e.g., a honeymoon, a budget backpacking trip, a luxury family vacation).</w:t>
+      </w:r>
+    </w:p>
+    <w:p>
+      <w:pPr>
+        <w:rPr>
+          <w:sz w:val="28"/>
+          <w:szCs w:val="28"/>
+        </w:rPr>
+      </w:pPr>
+      <w:r>
+        <w:rPr>
+          <w:sz w:val="28"/>
+          <w:szCs w:val="28"/>
+        </w:rPr>
+        <w:t>4.  **Output Format and constraints: 2/10**</w:t>
+      </w:r>
+    </w:p>
+    <w:p>
+      <w:pPr>
+        <w:rPr>
+          <w:sz w:val="28"/>
+          <w:szCs w:val="28"/>
+        </w:rPr>
+      </w:pPr>
+      <w:r>
+        <w:rPr>
+          <w:sz w:val="28"/>
+          <w:szCs w:val="28"/>
+        </w:rPr>
+        <w:t xml:space="preserve">    *   **</w:t>
+      </w:r>
+      <w:proofErr w:type="gramStart"/>
+      <w:r>
+        <w:rPr>
+          <w:sz w:val="28"/>
+          <w:szCs w:val="28"/>
+        </w:rPr>
+        <w:t>Explanation:*</w:t>
+      </w:r>
+      <w:proofErr w:type="gramEnd"/>
+      <w:r>
+        <w:rPr>
+          <w:sz w:val="28"/>
+          <w:szCs w:val="28"/>
+        </w:rPr>
+        <w:t>* The prompt asks to "plan the itinerary," which implies a structured output. However, it doesn't specify *how* the itinerary should be presented (e.g., daily breakdown, bullet points, table), what tone to use, or what level of detail (e.g., include hotels, transport, meal suggestions). No length constraints are given.</w:t>
+      </w:r>
+    </w:p>
+    <w:p>
+      <w:pPr>
+        <w:rPr>
+          <w:sz w:val="28"/>
+          <w:szCs w:val="28"/>
+        </w:rPr>
+      </w:pPr>
+      <w:r>
+        <w:rPr>
+          <w:sz w:val="28"/>
+          <w:szCs w:val="28"/>
+        </w:rPr>
+        <w:t>5.  **Confirm if a prompt assigns a specific role: 10/10**</w:t>
+      </w:r>
+    </w:p>
+    <w:p>
+      <w:pPr>
+        <w:rPr>
+          <w:sz w:val="28"/>
+          <w:szCs w:val="28"/>
+        </w:rPr>
+      </w:pPr>
+      <w:r>
+        <w:rPr>
+          <w:sz w:val="28"/>
+          <w:szCs w:val="28"/>
+        </w:rPr>
+        <w:t xml:space="preserve">    *   **</w:t>
+      </w:r>
+      <w:proofErr w:type="gramStart"/>
+      <w:r>
+        <w:rPr>
+          <w:sz w:val="28"/>
+          <w:szCs w:val="28"/>
+        </w:rPr>
+        <w:t>Explanation:*</w:t>
+      </w:r>
+      <w:proofErr w:type="gramEnd"/>
+      <w:r>
+        <w:rPr>
+          <w:sz w:val="28"/>
+          <w:szCs w:val="28"/>
+        </w:rPr>
+        <w:t>* The prompt clearly assigns a specific role: "You are Travel agent who plans vacations to destination in India."</w:t>
+      </w:r>
+    </w:p>
+    <w:p>
+      <w:pPr>
+        <w:rPr>
+          <w:sz w:val="28"/>
+          <w:szCs w:val="28"/>
+        </w:rPr>
+      </w:pPr>
+    </w:p>
+    <w:p>
+      <w:pPr>
+        <w:rPr>
+          <w:sz w:val="28"/>
+          <w:szCs w:val="28"/>
+        </w:rPr>
+      </w:pPr>
+      <w:r>
+        <w:rPr>
+          <w:sz w:val="28"/>
+          <w:szCs w:val="28"/>
+        </w:rPr>
+        <w:t xml:space="preserve">**Suggestions for improving the </w:t>
+      </w:r>
+      <w:proofErr w:type="gramStart"/>
+      <w:r>
+        <w:rPr>
+          <w:sz w:val="28"/>
+          <w:szCs w:val="28"/>
+        </w:rPr>
+        <w:t>prompt:*</w:t>
+      </w:r>
+      <w:proofErr w:type="gramEnd"/>
+      <w:r>
+        <w:rPr>
+          <w:sz w:val="28"/>
+          <w:szCs w:val="28"/>
+        </w:rPr>
+        <w:t>*</w:t>
+      </w:r>
+    </w:p>
+    <w:p>
+      <w:pPr>
+        <w:rPr>
+          <w:sz w:val="28"/>
+          <w:szCs w:val="28"/>
+        </w:rPr>
+      </w:pPr>
+    </w:p>
+    <w:p>
+      <w:pPr>
+        <w:rPr>
+          <w:sz w:val="28"/>
+          <w:szCs w:val="28"/>
+        </w:rPr>
+      </w:pPr>
+      <w:r>
+        <w:rPr>
+          <w:sz w:val="28"/>
+          <w:szCs w:val="28"/>
+        </w:rPr>
+        <w:t xml:space="preserve">1.  **Clarify Input and Add Traveler </w:t>
+      </w:r>
+      <w:proofErr w:type="gramStart"/>
+      <w:r>
+        <w:rPr>
+          <w:sz w:val="28"/>
+          <w:szCs w:val="28"/>
+        </w:rPr>
+        <w:t>Preferences:*</w:t>
+      </w:r>
+      <w:proofErr w:type="gramEnd"/>
+      <w:r>
+        <w:rPr>
+          <w:sz w:val="28"/>
+          <w:szCs w:val="28"/>
+        </w:rPr>
+        <w:t xml:space="preserve">* Instead of "number of </w:t>
+      </w:r>
+      <w:proofErr w:type="gramStart"/>
+      <w:r>
+        <w:rPr>
+          <w:sz w:val="28"/>
+          <w:szCs w:val="28"/>
+        </w:rPr>
+        <w:t>vacation</w:t>
+      </w:r>
+      <w:proofErr w:type="gramEnd"/>
+      <w:r>
+        <w:rPr>
+          <w:sz w:val="28"/>
+          <w:szCs w:val="28"/>
+        </w:rPr>
+        <w:t>," specify "number of days" or "duration of the trip." Also, ask for details about the traveler, such as "What is your budget (e.g., luxury, mid-range, budget-friendly)? What are your interests (e.g., adventure, culture, relaxation, food)? Are you traveling solo, with family, or as a couple?"</w:t>
+      </w:r>
+    </w:p>
+    <w:p>
+      <w:pPr>
+        <w:rPr>
+          <w:sz w:val="28"/>
+          <w:szCs w:val="28"/>
+        </w:rPr>
+      </w:pPr>
+      <w:r>
+        <w:rPr>
+          <w:sz w:val="28"/>
+          <w:szCs w:val="28"/>
+        </w:rPr>
+        <w:t xml:space="preserve">2.  **Specify Output Format and </w:t>
+      </w:r>
+      <w:proofErr w:type="gramStart"/>
+      <w:r>
+        <w:rPr>
+          <w:sz w:val="28"/>
+          <w:szCs w:val="28"/>
+        </w:rPr>
+        <w:t>Content:*</w:t>
+      </w:r>
+      <w:proofErr w:type="gramEnd"/>
+      <w:r>
+        <w:rPr>
+          <w:sz w:val="28"/>
+          <w:szCs w:val="28"/>
+        </w:rPr>
+        <w:t>* Define how you want the itinerary presented. For example, "Provide a day-by-day itinerary in bullet points, including suggested activities, places to visit, and recommended local cuisine. Also, suggest a suitable mode of transport between locations."</w:t>
+      </w:r>
+    </w:p>
+    <w:p>
+      <w:pPr>
+        <w:rPr>
+          <w:sz w:val="28"/>
+          <w:szCs w:val="28"/>
+        </w:rPr>
+      </w:pPr>
+      <w:r>
+        <w:rPr>
+          <w:sz w:val="28"/>
+          <w:szCs w:val="28"/>
+        </w:rPr>
         <w:lastRenderedPageBreak/>
-        <w:t xml:space="preserve">    *   **</w:t>
-      </w:r>
-      <w:proofErr w:type="gramStart"/>
-      <w:r>
-        <w:t>Explanation:*</w:t>
-      </w:r>
-      <w:proofErr w:type="gramEnd"/>
-      <w:r>
-        <w:t>* The prompt provides context by assigning the role of a "Travel agent who plans vacations to destination in India." This sets the scene. However, it lacks context about the *user's* specific needs or the purpose of this particular itinerary (e.g., a honeymoon, a budget backpacking trip, a luxury family vacation).</w:t>
-      </w:r>
-    </w:p>
-    <w:p>
-      <w:r>
-        <w:t>4.  **Output Format and constraints: 2/10**</w:t>
-      </w:r>
-    </w:p>
-    <w:p>
-      <w:r>
-        <w:t xml:space="preserve">    *   **</w:t>
-      </w:r>
-      <w:proofErr w:type="gramStart"/>
-      <w:r>
-        <w:t>Explanation:*</w:t>
-      </w:r>
-      <w:proofErr w:type="gramEnd"/>
-      <w:r>
-        <w:t>* The prompt asks to "plan the itinerary," which implies a structured output. However, it doesn't specify *how* the itinerary should be presented (e.g., daily breakdown, bullet points, table), what tone to use, or what level of detail (e.g., include hotels, transport, meal suggestions). No length constraints are given.</w:t>
-      </w:r>
-    </w:p>
-    <w:p>
-      <w:r>
-        <w:t>5.  **Confirm if a prompt assigns a specific role: 10/10**</w:t>
-      </w:r>
-    </w:p>
-    <w:p>
-      <w:r>
-        <w:t xml:space="preserve">    *   **</w:t>
-      </w:r>
-      <w:proofErr w:type="gramStart"/>
-      <w:r>
-        <w:t>Explanation:*</w:t>
-      </w:r>
-      <w:proofErr w:type="gramEnd"/>
-      <w:r>
-        <w:t>* The prompt clearly assigns a specific role: "You are Travel agent who plans vacations to destination in India."</w:t>
-      </w:r>
-    </w:p>
-    <w:p/>
-    <w:p>
-      <w:r>
-        <w:t xml:space="preserve">**Suggestions for improving the </w:t>
-      </w:r>
-      <w:proofErr w:type="gramStart"/>
-      <w:r>
-        <w:t>prompt:*</w:t>
-      </w:r>
-      <w:proofErr w:type="gramEnd"/>
-      <w:r>
-        <w:t>*</w:t>
-      </w:r>
-    </w:p>
-    <w:p/>
-    <w:p>
-      <w:r>
-        <w:t xml:space="preserve">1.  **Clarify Input and Add Traveler </w:t>
-      </w:r>
-      <w:proofErr w:type="gramStart"/>
-      <w:r>
-        <w:t>Preferences:*</w:t>
-      </w:r>
-      <w:proofErr w:type="gramEnd"/>
-      <w:r>
-        <w:t xml:space="preserve">* Instead of "number of </w:t>
-      </w:r>
-      <w:proofErr w:type="gramStart"/>
-      <w:r>
-        <w:t>vacation</w:t>
-      </w:r>
-      <w:proofErr w:type="gramEnd"/>
-      <w:r>
-        <w:t xml:space="preserve">," specify "number of days" or "duration of the trip." Also, ask for details about the </w:t>
-      </w:r>
-      <w:proofErr w:type="spellStart"/>
-      <w:r>
-        <w:t>traveler</w:t>
-      </w:r>
-      <w:proofErr w:type="spellEnd"/>
-      <w:r>
-        <w:t>, such as "What is your budget (e.g., luxury, mid-range, budget-friendly)? What are your interests (e.g., adventure, culture, relaxation, food)? Are you traveling solo, with family, or as a couple?"</w:t>
-      </w:r>
-    </w:p>
-    <w:p>
-      <w:r>
-        <w:t xml:space="preserve">2.  **Specify Output Format and </w:t>
-      </w:r>
-      <w:proofErr w:type="gramStart"/>
-      <w:r>
-        <w:t>Content:*</w:t>
-      </w:r>
-      <w:proofErr w:type="gramEnd"/>
-      <w:r>
-        <w:t>* Define how you want the itinerary presented. For example, "Provide a day-by-day itinerary in bullet points, including suggested activities, places to visit, and recommended local cuisine. Also, suggest a suitable mode of transport between locations."</w:t>
-      </w:r>
-    </w:p>
-    <w:p>
-      <w:r>
         <w:t xml:space="preserve">3.  **Add Constraints and Desired </w:t>
       </w:r>
       <w:proofErr w:type="gramStart"/>
       <w:r>
+        <w:rPr>
+          <w:sz w:val="28"/>
+          <w:szCs w:val="28"/>
+        </w:rPr>
         <w:t>Inclusions:*</w:t>
       </w:r>
       <w:proofErr w:type="gramEnd"/>
       <w:r>
+        <w:rPr>
+          <w:sz w:val="28"/>
+          <w:szCs w:val="28"/>
+        </w:rPr>
         <w:t>* Mention any specific constraints or desired inclusions. For instance, "Ensure the itinerary is suitable for a family with young children," or "Include options for sustainable travel," or "Suggest unique off-the-beaten-path experiences."</w:t>
       </w:r>
     </w:p>
@@ -402,26 +782,82 @@
     <w:p/>
     <w:p>
       <w:pPr>
-        <w:pStyle w:val="ListParagraph"/>
-        <w:numPr>
-          <w:ilvl w:val="0"/>
-          <w:numId w:val="1"/>
-        </w:numPr>
-      </w:pPr>
-      <w:r>
-        <w:lastRenderedPageBreak/>
+        <w:rPr>
+          <w:b/>
+          <w:bCs/>
+          <w:sz w:val="44"/>
+          <w:szCs w:val="44"/>
+        </w:rPr>
+      </w:pPr>
+      <w:r>
+        <w:rPr>
+          <w:b/>
+          <w:bCs/>
+          <w:sz w:val="44"/>
+          <w:szCs w:val="44"/>
+        </w:rPr>
+        <w:t>Test</w:t>
+      </w:r>
+      <w:r>
+        <w:rPr>
+          <w:b/>
+          <w:bCs/>
+          <w:sz w:val="44"/>
+          <w:szCs w:val="44"/>
+        </w:rPr>
+        <w:t>2</w:t>
+      </w:r>
+      <w:r>
+        <w:rPr>
+          <w:b/>
+          <w:bCs/>
+          <w:sz w:val="44"/>
+          <w:szCs w:val="44"/>
+        </w:rPr>
+        <w:t xml:space="preserve"> - Input</w:t>
+      </w:r>
+    </w:p>
+    <w:p/>
+    <w:p>
+      <w:pPr>
+        <w:rPr>
+          <w:sz w:val="28"/>
+          <w:szCs w:val="28"/>
+        </w:rPr>
+      </w:pPr>
+      <w:r>
+        <w:rPr>
+          <w:sz w:val="28"/>
+          <w:szCs w:val="28"/>
+        </w:rPr>
         <w:t xml:space="preserve">You are agent named Data who is an expert in Star Trek Universe. You answer question on all the seasons on Star </w:t>
       </w:r>
       <w:r>
+        <w:rPr>
+          <w:sz w:val="28"/>
+          <w:szCs w:val="28"/>
+        </w:rPr>
         <w:t>Trek starting</w:t>
       </w:r>
       <w:r>
+        <w:rPr>
+          <w:sz w:val="28"/>
+          <w:szCs w:val="28"/>
+        </w:rPr>
         <w:t xml:space="preserve"> from Star Trek Original series to the Star Trek Academy. The user provides the Character name as an </w:t>
       </w:r>
       <w:r>
+        <w:rPr>
+          <w:sz w:val="28"/>
+          <w:szCs w:val="28"/>
+        </w:rPr>
         <w:t>input,</w:t>
       </w:r>
       <w:r>
+        <w:rPr>
+          <w:sz w:val="28"/>
+          <w:szCs w:val="28"/>
+        </w:rPr>
         <w:t xml:space="preserve"> The output should list </w:t>
       </w:r>
     </w:p>
@@ -432,8 +868,16 @@
           <w:ilvl w:val="0"/>
           <w:numId w:val="3"/>
         </w:numPr>
-      </w:pPr>
-      <w:r>
+        <w:rPr>
+          <w:sz w:val="28"/>
+          <w:szCs w:val="28"/>
+        </w:rPr>
+      </w:pPr>
+      <w:r>
+        <w:rPr>
+          <w:sz w:val="28"/>
+          <w:szCs w:val="28"/>
+        </w:rPr>
         <w:t>The season the character appears</w:t>
       </w:r>
     </w:p>
@@ -444,8 +888,16 @@
           <w:ilvl w:val="0"/>
           <w:numId w:val="3"/>
         </w:numPr>
-      </w:pPr>
-      <w:r>
+        <w:rPr>
+          <w:sz w:val="28"/>
+          <w:szCs w:val="28"/>
+        </w:rPr>
+      </w:pPr>
+      <w:r>
+        <w:rPr>
+          <w:sz w:val="28"/>
+          <w:szCs w:val="28"/>
+        </w:rPr>
         <w:t>The character biography in Star Trek</w:t>
       </w:r>
     </w:p>
@@ -456,8 +908,16 @@
           <w:ilvl w:val="0"/>
           <w:numId w:val="3"/>
         </w:numPr>
-      </w:pPr>
-      <w:r>
+        <w:rPr>
+          <w:sz w:val="28"/>
+          <w:szCs w:val="28"/>
+        </w:rPr>
+      </w:pPr>
+      <w:r>
+        <w:rPr>
+          <w:sz w:val="28"/>
+          <w:szCs w:val="28"/>
+        </w:rPr>
         <w:t>Number of episodes the character appears</w:t>
       </w:r>
     </w:p>
@@ -468,289 +928,2525 @@
           <w:ilvl w:val="0"/>
           <w:numId w:val="3"/>
         </w:numPr>
-      </w:pPr>
-      <w:r>
+        <w:rPr>
+          <w:sz w:val="28"/>
+          <w:szCs w:val="28"/>
+        </w:rPr>
+      </w:pPr>
+      <w:r>
+        <w:rPr>
+          <w:sz w:val="28"/>
+          <w:szCs w:val="28"/>
+        </w:rPr>
         <w:t>Which alien race the character belongs to</w:t>
       </w:r>
     </w:p>
     <w:p/>
     <w:p>
-      <w:r>
+      <w:pPr>
+        <w:rPr>
+          <w:b/>
+          <w:bCs/>
+          <w:sz w:val="44"/>
+          <w:szCs w:val="44"/>
+        </w:rPr>
+      </w:pPr>
+      <w:r>
+        <w:rPr>
+          <w:b/>
+          <w:bCs/>
+          <w:sz w:val="44"/>
+          <w:szCs w:val="44"/>
+        </w:rPr>
+        <w:t xml:space="preserve">Test2 - </w:t>
+      </w:r>
+      <w:r>
+        <w:rPr>
+          <w:b/>
+          <w:bCs/>
+          <w:sz w:val="44"/>
+          <w:szCs w:val="44"/>
+        </w:rPr>
         <w:t>Output</w:t>
       </w:r>
     </w:p>
     <w:p/>
     <w:p>
-      <w:r>
+      <w:pPr>
+        <w:rPr>
+          <w:sz w:val="28"/>
+          <w:szCs w:val="28"/>
+        </w:rPr>
+      </w:pPr>
+      <w:r>
+        <w:rPr>
+          <w:sz w:val="28"/>
+          <w:szCs w:val="28"/>
+        </w:rPr>
         <w:t>Here's the evaluation of your prompt:</w:t>
       </w:r>
     </w:p>
+    <w:p>
+      <w:pPr>
+        <w:rPr>
+          <w:sz w:val="28"/>
+          <w:szCs w:val="28"/>
+        </w:rPr>
+      </w:pPr>
+    </w:p>
+    <w:p>
+      <w:pPr>
+        <w:rPr>
+          <w:sz w:val="28"/>
+          <w:szCs w:val="28"/>
+        </w:rPr>
+      </w:pPr>
+      <w:r>
+        <w:rPr>
+          <w:sz w:val="28"/>
+          <w:szCs w:val="28"/>
+        </w:rPr>
+        <w:lastRenderedPageBreak/>
+        <w:t>**Final Score: 8.2 / 10**</w:t>
+      </w:r>
+    </w:p>
+    <w:p>
+      <w:pPr>
+        <w:rPr>
+          <w:sz w:val="28"/>
+          <w:szCs w:val="28"/>
+        </w:rPr>
+      </w:pPr>
+    </w:p>
+    <w:p>
+      <w:pPr>
+        <w:rPr>
+          <w:sz w:val="28"/>
+          <w:szCs w:val="28"/>
+        </w:rPr>
+      </w:pPr>
+      <w:r>
+        <w:rPr>
+          <w:sz w:val="28"/>
+          <w:szCs w:val="28"/>
+        </w:rPr>
+        <w:t xml:space="preserve">**Scores for each Quality </w:t>
+      </w:r>
+      <w:proofErr w:type="gramStart"/>
+      <w:r>
+        <w:rPr>
+          <w:sz w:val="28"/>
+          <w:szCs w:val="28"/>
+        </w:rPr>
+        <w:t>Criterion:*</w:t>
+      </w:r>
+      <w:proofErr w:type="gramEnd"/>
+      <w:r>
+        <w:rPr>
+          <w:sz w:val="28"/>
+          <w:szCs w:val="28"/>
+        </w:rPr>
+        <w:t>*</w:t>
+      </w:r>
+    </w:p>
+    <w:p>
+      <w:pPr>
+        <w:rPr>
+          <w:sz w:val="28"/>
+          <w:szCs w:val="28"/>
+        </w:rPr>
+      </w:pPr>
+    </w:p>
+    <w:p>
+      <w:pPr>
+        <w:rPr>
+          <w:sz w:val="28"/>
+          <w:szCs w:val="28"/>
+        </w:rPr>
+      </w:pPr>
+      <w:r>
+        <w:rPr>
+          <w:sz w:val="28"/>
+          <w:szCs w:val="28"/>
+        </w:rPr>
+        <w:t>1.  **Clarity of prompt: 9/10**</w:t>
+      </w:r>
+    </w:p>
+    <w:p>
+      <w:pPr>
+        <w:rPr>
+          <w:sz w:val="28"/>
+          <w:szCs w:val="28"/>
+        </w:rPr>
+      </w:pPr>
+      <w:r>
+        <w:rPr>
+          <w:sz w:val="28"/>
+          <w:szCs w:val="28"/>
+        </w:rPr>
+        <w:t xml:space="preserve">    *   **</w:t>
+      </w:r>
+      <w:proofErr w:type="gramStart"/>
+      <w:r>
+        <w:rPr>
+          <w:sz w:val="28"/>
+          <w:szCs w:val="28"/>
+        </w:rPr>
+        <w:t>Explanation:*</w:t>
+      </w:r>
+      <w:proofErr w:type="gramEnd"/>
+      <w:r>
+        <w:rPr>
+          <w:sz w:val="28"/>
+          <w:szCs w:val="28"/>
+        </w:rPr>
+        <w:t>* The prompt is very clear and easy to understand. It explicitly states the role, the domain of expertise, the input, and the desired output elements.</w:t>
+      </w:r>
+    </w:p>
+    <w:p>
+      <w:pPr>
+        <w:rPr>
+          <w:sz w:val="28"/>
+          <w:szCs w:val="28"/>
+        </w:rPr>
+      </w:pPr>
+      <w:r>
+        <w:rPr>
+          <w:sz w:val="28"/>
+          <w:szCs w:val="28"/>
+        </w:rPr>
+        <w:t>2.  **Specificity/Details: 8/10**</w:t>
+      </w:r>
+    </w:p>
+    <w:p>
+      <w:pPr>
+        <w:rPr>
+          <w:sz w:val="28"/>
+          <w:szCs w:val="28"/>
+        </w:rPr>
+      </w:pPr>
+      <w:r>
+        <w:rPr>
+          <w:sz w:val="28"/>
+          <w:szCs w:val="28"/>
+        </w:rPr>
+        <w:t xml:space="preserve">    *   **</w:t>
+      </w:r>
+      <w:proofErr w:type="gramStart"/>
+      <w:r>
+        <w:rPr>
+          <w:sz w:val="28"/>
+          <w:szCs w:val="28"/>
+        </w:rPr>
+        <w:t>Explanation:*</w:t>
+      </w:r>
+      <w:proofErr w:type="gramEnd"/>
+      <w:r>
+        <w:rPr>
+          <w:sz w:val="28"/>
+          <w:szCs w:val="28"/>
+        </w:rPr>
+        <w:t>* The prompt provides good detail regarding the scope (all Star Trek seasons from Original to Academy) and the specific information points required for the output (season, biography, episode count, alien race). However, it could be slightly more specific about the *depth* of the biography or how to handle characters appearing in multiple series/seasons.</w:t>
+      </w:r>
+    </w:p>
+    <w:p>
+      <w:pPr>
+        <w:rPr>
+          <w:sz w:val="28"/>
+          <w:szCs w:val="28"/>
+        </w:rPr>
+      </w:pPr>
+      <w:r>
+        <w:rPr>
+          <w:sz w:val="28"/>
+          <w:szCs w:val="28"/>
+        </w:rPr>
+        <w:t>3.  **Context: 8/10**</w:t>
+      </w:r>
+    </w:p>
+    <w:p>
+      <w:pPr>
+        <w:rPr>
+          <w:sz w:val="28"/>
+          <w:szCs w:val="28"/>
+        </w:rPr>
+      </w:pPr>
+      <w:r>
+        <w:rPr>
+          <w:sz w:val="28"/>
+          <w:szCs w:val="28"/>
+        </w:rPr>
+        <w:t xml:space="preserve">    *   **</w:t>
+      </w:r>
+      <w:proofErr w:type="gramStart"/>
+      <w:r>
+        <w:rPr>
+          <w:sz w:val="28"/>
+          <w:szCs w:val="28"/>
+        </w:rPr>
+        <w:t>Explanation:*</w:t>
+      </w:r>
+      <w:proofErr w:type="gramEnd"/>
+      <w:r>
+        <w:rPr>
+          <w:sz w:val="28"/>
+          <w:szCs w:val="28"/>
+        </w:rPr>
+        <w:t>* The context is well-established by assigning the role of "Data, an expert in Star Trek Universe" and defining the scope of knowledge. The use case (answering character questions) is also clear. No specific audience or broader purpose is mentioned, but for this type of factual query, it's largely sufficient.</w:t>
+      </w:r>
+    </w:p>
+    <w:p>
+      <w:pPr>
+        <w:rPr>
+          <w:sz w:val="28"/>
+          <w:szCs w:val="28"/>
+        </w:rPr>
+      </w:pPr>
+      <w:r>
+        <w:rPr>
+          <w:sz w:val="28"/>
+          <w:szCs w:val="28"/>
+        </w:rPr>
+        <w:t>4.  **Output Format and constraints: 6/10**</w:t>
+      </w:r>
+    </w:p>
+    <w:p>
+      <w:pPr>
+        <w:rPr>
+          <w:sz w:val="28"/>
+          <w:szCs w:val="28"/>
+        </w:rPr>
+      </w:pPr>
+      <w:r>
+        <w:rPr>
+          <w:sz w:val="28"/>
+          <w:szCs w:val="28"/>
+        </w:rPr>
+        <w:t xml:space="preserve">    *   **</w:t>
+      </w:r>
+      <w:proofErr w:type="gramStart"/>
+      <w:r>
+        <w:rPr>
+          <w:sz w:val="28"/>
+          <w:szCs w:val="28"/>
+        </w:rPr>
+        <w:t>Explanation:*</w:t>
+      </w:r>
+      <w:proofErr w:type="gramEnd"/>
+      <w:r>
+        <w:rPr>
+          <w:sz w:val="28"/>
+          <w:szCs w:val="28"/>
+        </w:rPr>
+        <w:t>* While the *elements* of the output are clearly listed (a, b, c, d), the prompt does not specify the *format* (e.g., bullet points, a table, JSON, a conversational paragraph), the desired *tone*, or any *length constraints* for the biography or the overall response.</w:t>
+      </w:r>
+    </w:p>
+    <w:p>
+      <w:pPr>
+        <w:rPr>
+          <w:sz w:val="28"/>
+          <w:szCs w:val="28"/>
+        </w:rPr>
+      </w:pPr>
+      <w:r>
+        <w:rPr>
+          <w:sz w:val="28"/>
+          <w:szCs w:val="28"/>
+        </w:rPr>
+        <w:t>5.  **Confirm if a prompt assigns a specific role: 10/10**</w:t>
+      </w:r>
+    </w:p>
+    <w:p>
+      <w:pPr>
+        <w:rPr>
+          <w:sz w:val="28"/>
+          <w:szCs w:val="28"/>
+        </w:rPr>
+      </w:pPr>
+      <w:r>
+        <w:rPr>
+          <w:sz w:val="28"/>
+          <w:szCs w:val="28"/>
+        </w:rPr>
+        <w:t xml:space="preserve">    *   **</w:t>
+      </w:r>
+      <w:proofErr w:type="gramStart"/>
+      <w:r>
+        <w:rPr>
+          <w:sz w:val="28"/>
+          <w:szCs w:val="28"/>
+        </w:rPr>
+        <w:t>Explanation:*</w:t>
+      </w:r>
+      <w:proofErr w:type="gramEnd"/>
+      <w:r>
+        <w:rPr>
+          <w:sz w:val="28"/>
+          <w:szCs w:val="28"/>
+        </w:rPr>
+        <w:t>* The prompt explicitly assigns a clear and specific role: "You are agent named Data who is an expert in Star Trek Universe."</w:t>
+      </w:r>
+    </w:p>
+    <w:p>
+      <w:pPr>
+        <w:rPr>
+          <w:sz w:val="28"/>
+          <w:szCs w:val="28"/>
+        </w:rPr>
+      </w:pPr>
+    </w:p>
+    <w:p>
+      <w:pPr>
+        <w:rPr>
+          <w:sz w:val="28"/>
+          <w:szCs w:val="28"/>
+        </w:rPr>
+      </w:pPr>
+      <w:r>
+        <w:rPr>
+          <w:sz w:val="28"/>
+          <w:szCs w:val="28"/>
+        </w:rPr>
+        <w:t xml:space="preserve">**Suggestions for improving the </w:t>
+      </w:r>
+      <w:proofErr w:type="gramStart"/>
+      <w:r>
+        <w:rPr>
+          <w:sz w:val="28"/>
+          <w:szCs w:val="28"/>
+        </w:rPr>
+        <w:t>prompt:*</w:t>
+      </w:r>
+      <w:proofErr w:type="gramEnd"/>
+      <w:r>
+        <w:rPr>
+          <w:sz w:val="28"/>
+          <w:szCs w:val="28"/>
+        </w:rPr>
+        <w:t>*</w:t>
+      </w:r>
+    </w:p>
+    <w:p>
+      <w:pPr>
+        <w:rPr>
+          <w:sz w:val="28"/>
+          <w:szCs w:val="28"/>
+        </w:rPr>
+      </w:pPr>
+    </w:p>
+    <w:p>
+      <w:pPr>
+        <w:rPr>
+          <w:sz w:val="28"/>
+          <w:szCs w:val="28"/>
+        </w:rPr>
+      </w:pPr>
+      <w:r>
+        <w:rPr>
+          <w:sz w:val="28"/>
+          <w:szCs w:val="28"/>
+        </w:rPr>
+        <w:t xml:space="preserve">1.  **Specify Output </w:t>
+      </w:r>
+      <w:proofErr w:type="gramStart"/>
+      <w:r>
+        <w:rPr>
+          <w:sz w:val="28"/>
+          <w:szCs w:val="28"/>
+        </w:rPr>
+        <w:t>Format:*</w:t>
+      </w:r>
+      <w:proofErr w:type="gramEnd"/>
+      <w:r>
+        <w:rPr>
+          <w:sz w:val="28"/>
+          <w:szCs w:val="28"/>
+        </w:rPr>
+        <w:t>* Clearly define how the output should be structured. For example, "The output should be presented as a bulleted list for each character, with the biography as a concise paragraph." or "Provide the output in a JSON format."</w:t>
+      </w:r>
+    </w:p>
+    <w:p>
+      <w:pPr>
+        <w:rPr>
+          <w:sz w:val="28"/>
+          <w:szCs w:val="28"/>
+        </w:rPr>
+      </w:pPr>
+      <w:r>
+        <w:rPr>
+          <w:sz w:val="28"/>
+          <w:szCs w:val="28"/>
+        </w:rPr>
+        <w:t xml:space="preserve">2.  **Refine Output </w:t>
+      </w:r>
+      <w:proofErr w:type="gramStart"/>
+      <w:r>
+        <w:rPr>
+          <w:sz w:val="28"/>
+          <w:szCs w:val="28"/>
+        </w:rPr>
+        <w:t>Details:*</w:t>
+      </w:r>
+      <w:proofErr w:type="gramEnd"/>
+      <w:r>
+        <w:rPr>
+          <w:sz w:val="28"/>
+          <w:szCs w:val="28"/>
+        </w:rPr>
+        <w:t>* Clarify the expected length/depth of the "character biography" (e.g., "a concise summary of their key roles and arcs," "a detailed overview"). Also, consider adding instructions for characters appearing in multiple series/seasons (e.g., "list all series/seasons they appear in") and how to handle human characters under "alien race" (e.g., "state 'Human' if applicable").</w:t>
+      </w:r>
+    </w:p>
+    <w:p>
+      <w:pPr>
+        <w:rPr>
+          <w:sz w:val="28"/>
+          <w:szCs w:val="28"/>
+        </w:rPr>
+      </w:pPr>
+      <w:r>
+        <w:rPr>
+          <w:sz w:val="28"/>
+          <w:szCs w:val="28"/>
+        </w:rPr>
+        <w:t xml:space="preserve">3.  **Add Error Handling/Edge </w:t>
+      </w:r>
+      <w:proofErr w:type="gramStart"/>
+      <w:r>
+        <w:rPr>
+          <w:sz w:val="28"/>
+          <w:szCs w:val="28"/>
+        </w:rPr>
+        <w:t>Cases:*</w:t>
+      </w:r>
+      <w:proofErr w:type="gramEnd"/>
+      <w:r>
+        <w:rPr>
+          <w:sz w:val="28"/>
+          <w:szCs w:val="28"/>
+        </w:rPr>
+        <w:t>* Instruct the agent on how to respond if a character is not found in the Star Trek universe or if the input is ambiguous. For example, "If the character is not found, politely inform the user and suggest checking the spelling."</w:t>
+      </w:r>
+    </w:p>
     <w:p/>
     <w:p>
-      <w:r>
-        <w:t>**Final Score: 8.2 / 10**</w:t>
-      </w:r>
-    </w:p>
-    <w:p/>
-    <w:p>
-      <w:r>
-        <w:t xml:space="preserve">**Scores for each Quality </w:t>
-      </w:r>
-      <w:proofErr w:type="gramStart"/>
-      <w:r>
-        <w:t>Criterion:*</w:t>
-      </w:r>
-      <w:proofErr w:type="gramEnd"/>
-      <w:r>
-        <w:t>*</w:t>
-      </w:r>
-    </w:p>
-    <w:p/>
-    <w:p>
-      <w:r>
-        <w:t>1.  **Clarity of prompt: 9/10**</w:t>
-      </w:r>
-    </w:p>
-    <w:p>
-      <w:r>
-        <w:t xml:space="preserve">    *   **</w:t>
-      </w:r>
-      <w:proofErr w:type="gramStart"/>
-      <w:r>
-        <w:t>Explanation:*</w:t>
-      </w:r>
-      <w:proofErr w:type="gramEnd"/>
-      <w:r>
-        <w:t>* The prompt is very clear and easy to understand. It explicitly states the role, the domain of expertise, the input, and the desired output elements.</w:t>
-      </w:r>
-    </w:p>
-    <w:p>
-      <w:r>
-        <w:t>2.  **Specificity/Details: 8/10**</w:t>
-      </w:r>
-    </w:p>
-    <w:p>
-      <w:r>
-        <w:t xml:space="preserve">    *   **</w:t>
-      </w:r>
-      <w:proofErr w:type="gramStart"/>
-      <w:r>
-        <w:t>Explanation:*</w:t>
-      </w:r>
-      <w:proofErr w:type="gramEnd"/>
-      <w:r>
-        <w:t>* The prompt provides good detail regarding the scope (all Star Trek seasons from Original to Academy) and the specific information points required for the output (season, biography, episode count, alien race). However, it could be slightly more specific about the *depth* of the biography or how to handle characters appearing in multiple series/seasons.</w:t>
-      </w:r>
-    </w:p>
-    <w:p>
-      <w:r>
-        <w:t>3.  **Context: 8/10**</w:t>
-      </w:r>
-    </w:p>
-    <w:p>
-      <w:r>
-        <w:t xml:space="preserve">    *   **</w:t>
-      </w:r>
-      <w:proofErr w:type="gramStart"/>
-      <w:r>
-        <w:t>Explanation:*</w:t>
-      </w:r>
-      <w:proofErr w:type="gramEnd"/>
-      <w:r>
-        <w:t>* The context is well-established by assigning the role of "Data, an expert in Star Trek Universe" and defining the scope of knowledge. The use case (answering character questions) is also clear. No specific audience or broader purpose is mentioned, but for this type of factual query, it's largely sufficient.</w:t>
-      </w:r>
-    </w:p>
-    <w:p>
-      <w:r>
-        <w:t>4.  **Output Format and constraints: 6/10**</w:t>
-      </w:r>
-    </w:p>
-    <w:p>
-      <w:r>
-        <w:t xml:space="preserve">    *   **</w:t>
-      </w:r>
-      <w:proofErr w:type="gramStart"/>
-      <w:r>
-        <w:t>Explanation:*</w:t>
-      </w:r>
-      <w:proofErr w:type="gramEnd"/>
-      <w:r>
-        <w:t>* While the *elements* of the output are clearly listed (a, b, c, d), the prompt does not specify the *format* (e.g., bullet points, a table, JSON, a conversational paragraph), the desired *tone*, or any *length constraints* for the biography or the overall response.</w:t>
-      </w:r>
-    </w:p>
-    <w:p>
-      <w:r>
-        <w:t>5.  **Confirm if a prompt assigns a specific role: 10/10**</w:t>
-      </w:r>
-    </w:p>
-    <w:p>
-      <w:r>
-        <w:t xml:space="preserve">    *   **</w:t>
-      </w:r>
-      <w:proofErr w:type="gramStart"/>
-      <w:r>
-        <w:t>Explanation:*</w:t>
-      </w:r>
-      <w:proofErr w:type="gramEnd"/>
-      <w:r>
-        <w:t>* The prompt explicitly assigns a clear and specific role: "You are agent named Data who is an expert in Star Trek Universe."</w:t>
-      </w:r>
-    </w:p>
-    <w:p/>
-    <w:p>
-      <w:r>
-        <w:lastRenderedPageBreak/>
-        <w:t xml:space="preserve">**Suggestions for improving the </w:t>
-      </w:r>
-      <w:proofErr w:type="gramStart"/>
-      <w:r>
-        <w:t>prompt:*</w:t>
-      </w:r>
-      <w:proofErr w:type="gramEnd"/>
-      <w:r>
-        <w:t>*</w:t>
-      </w:r>
-    </w:p>
-    <w:p/>
-    <w:p>
-      <w:r>
-        <w:t xml:space="preserve">1.  **Specify Output </w:t>
-      </w:r>
-      <w:proofErr w:type="gramStart"/>
-      <w:r>
-        <w:t>Format:*</w:t>
-      </w:r>
-      <w:proofErr w:type="gramEnd"/>
-      <w:r>
-        <w:t>* Clearly define how the output should be structured. For example, "The output should be presented as a bulleted list for each character, with the biography as a concise paragraph." or "Provide the output in a JSON format."</w:t>
-      </w:r>
-    </w:p>
-    <w:p>
-      <w:r>
-        <w:t xml:space="preserve">2.  **Refine Output </w:t>
-      </w:r>
-      <w:proofErr w:type="gramStart"/>
-      <w:r>
-        <w:t>Details:*</w:t>
-      </w:r>
-      <w:proofErr w:type="gramEnd"/>
-      <w:r>
-        <w:t>* Clarify the expected length/depth of the "character biography" (e.g., "a concise summary of their key roles and arcs," "a detailed overview"). Also, consider adding instructions for characters appearing in multiple series/seasons (e.g., "list all series/seasons they appear in") and how to handle human characters under "alien race" (e.g., "state 'Human' if applicable").</w:t>
-      </w:r>
-    </w:p>
-    <w:p>
-      <w:r>
-        <w:t xml:space="preserve">3.  **Add Error Handling/Edge </w:t>
-      </w:r>
-      <w:proofErr w:type="gramStart"/>
-      <w:r>
-        <w:t>Cases:*</w:t>
-      </w:r>
-      <w:proofErr w:type="gramEnd"/>
-      <w:r>
-        <w:t>* Instruct the agent on how to respond if a character is not found in the Star Trek universe or if the input is ambiguous. For example, "If the character is not found, politely inform the user and suggest checking the spelling."</w:t>
+      <w:pPr>
+        <w:rPr>
+          <w:b/>
+          <w:bCs/>
+          <w:sz w:val="44"/>
+          <w:szCs w:val="44"/>
+        </w:rPr>
+      </w:pPr>
+      <w:r>
+        <w:rPr>
+          <w:b/>
+          <w:bCs/>
+          <w:sz w:val="44"/>
+          <w:szCs w:val="44"/>
+        </w:rPr>
+        <w:t>Test</w:t>
+      </w:r>
+      <w:r>
+        <w:rPr>
+          <w:b/>
+          <w:bCs/>
+          <w:sz w:val="44"/>
+          <w:szCs w:val="44"/>
+        </w:rPr>
+        <w:t>3</w:t>
+      </w:r>
+      <w:r>
+        <w:rPr>
+          <w:b/>
+          <w:bCs/>
+          <w:sz w:val="44"/>
+          <w:szCs w:val="44"/>
+        </w:rPr>
+        <w:t xml:space="preserve"> - Input</w:t>
       </w:r>
     </w:p>
     <w:p/>
     <w:p/>
+    <w:p>
+      <w:pPr>
+        <w:rPr>
+          <w:sz w:val="28"/>
+          <w:szCs w:val="28"/>
+        </w:rPr>
+      </w:pPr>
+      <w:r>
+        <w:rPr>
+          <w:sz w:val="28"/>
+          <w:szCs w:val="28"/>
+        </w:rPr>
+        <w:t xml:space="preserve">You are restaurant advisor who takes the cuisine of the restaurant and provides the user with list of restaurants in a </w:t>
+      </w:r>
+      <w:proofErr w:type="gramStart"/>
+      <w:r>
+        <w:rPr>
+          <w:sz w:val="28"/>
+          <w:szCs w:val="28"/>
+        </w:rPr>
+        <w:t>10 mile</w:t>
+      </w:r>
+      <w:proofErr w:type="gramEnd"/>
+      <w:r>
+        <w:rPr>
+          <w:sz w:val="28"/>
+          <w:szCs w:val="28"/>
+        </w:rPr>
+        <w:t xml:space="preserve"> radius. In the output add the rating of restaurant and the best dishes in each </w:t>
+      </w:r>
+      <w:r>
+        <w:rPr>
+          <w:sz w:val="28"/>
+          <w:szCs w:val="28"/>
+        </w:rPr>
+        <w:t>restaurant</w:t>
+      </w:r>
+    </w:p>
     <w:p/>
     <w:p>
       <w:pPr>
-        <w:pStyle w:val="ListParagraph"/>
-        <w:numPr>
-          <w:ilvl w:val="0"/>
-          <w:numId w:val="1"/>
-        </w:numPr>
-      </w:pPr>
-      <w:r>
-        <w:t xml:space="preserve">You are restaurant advisor who takes the cuisine of the restaurant and provides the user with list of restaurants in a </w:t>
-      </w:r>
-      <w:proofErr w:type="gramStart"/>
-      <w:r>
-        <w:t>10 mile</w:t>
-      </w:r>
-      <w:proofErr w:type="gramEnd"/>
-      <w:r>
-        <w:t xml:space="preserve"> radius. In the output add the rating of restaurant and the best dishes in each </w:t>
-      </w:r>
-      <w:r>
-        <w:t>restaurant</w:t>
+        <w:rPr>
+          <w:b/>
+          <w:bCs/>
+          <w:sz w:val="44"/>
+          <w:szCs w:val="44"/>
+        </w:rPr>
+      </w:pPr>
+      <w:r>
+        <w:rPr>
+          <w:b/>
+          <w:bCs/>
+          <w:sz w:val="44"/>
+          <w:szCs w:val="44"/>
+        </w:rPr>
+        <w:t>Test</w:t>
+      </w:r>
+      <w:r>
+        <w:rPr>
+          <w:b/>
+          <w:bCs/>
+          <w:sz w:val="44"/>
+          <w:szCs w:val="44"/>
+        </w:rPr>
+        <w:t>3-Output</w:t>
+      </w:r>
+    </w:p>
+    <w:p>
+      <w:pPr>
+        <w:rPr>
+          <w:b/>
+          <w:bCs/>
+          <w:sz w:val="44"/>
+          <w:szCs w:val="44"/>
+        </w:rPr>
+      </w:pPr>
+    </w:p>
+    <w:p>
+      <w:pPr>
+        <w:pStyle w:val="ListParagraph"/>
+        <w:rPr>
+          <w:sz w:val="28"/>
+          <w:szCs w:val="28"/>
+        </w:rPr>
+      </w:pPr>
+      <w:r>
+        <w:rPr>
+          <w:sz w:val="28"/>
+          <w:szCs w:val="28"/>
+        </w:rPr>
+        <w:t xml:space="preserve">**Final </w:t>
+      </w:r>
+      <w:proofErr w:type="gramStart"/>
+      <w:r>
+        <w:rPr>
+          <w:sz w:val="28"/>
+          <w:szCs w:val="28"/>
+        </w:rPr>
+        <w:t>Score:*</w:t>
+      </w:r>
+      <w:proofErr w:type="gramEnd"/>
+      <w:r>
+        <w:rPr>
+          <w:sz w:val="28"/>
+          <w:szCs w:val="28"/>
+        </w:rPr>
+        <w:t>* 6.6/10</w:t>
+      </w:r>
+    </w:p>
+    <w:p>
+      <w:pPr>
+        <w:pStyle w:val="ListParagraph"/>
+        <w:rPr>
+          <w:sz w:val="28"/>
+          <w:szCs w:val="28"/>
+        </w:rPr>
+      </w:pPr>
+    </w:p>
+    <w:p>
+      <w:pPr>
+        <w:pStyle w:val="ListParagraph"/>
+        <w:rPr>
+          <w:sz w:val="28"/>
+          <w:szCs w:val="28"/>
+        </w:rPr>
+      </w:pPr>
+      <w:r>
+        <w:rPr>
+          <w:sz w:val="28"/>
+          <w:szCs w:val="28"/>
+        </w:rPr>
+        <w:t xml:space="preserve">**Scores for each Quality </w:t>
+      </w:r>
+      <w:proofErr w:type="gramStart"/>
+      <w:r>
+        <w:rPr>
+          <w:sz w:val="28"/>
+          <w:szCs w:val="28"/>
+        </w:rPr>
+        <w:t>Criterion:*</w:t>
+      </w:r>
+      <w:proofErr w:type="gramEnd"/>
+      <w:r>
+        <w:rPr>
+          <w:sz w:val="28"/>
+          <w:szCs w:val="28"/>
+        </w:rPr>
+        <w:t>*</w:t>
+      </w:r>
+    </w:p>
+    <w:p>
+      <w:pPr>
+        <w:pStyle w:val="ListParagraph"/>
+        <w:rPr>
+          <w:sz w:val="28"/>
+          <w:szCs w:val="28"/>
+        </w:rPr>
+      </w:pPr>
+    </w:p>
+    <w:p>
+      <w:pPr>
+        <w:pStyle w:val="ListParagraph"/>
+        <w:rPr>
+          <w:sz w:val="28"/>
+          <w:szCs w:val="28"/>
+        </w:rPr>
+      </w:pPr>
+      <w:r>
+        <w:rPr>
+          <w:sz w:val="28"/>
+          <w:szCs w:val="28"/>
+        </w:rPr>
+        <w:lastRenderedPageBreak/>
+        <w:t>1.  **</w:t>
+      </w:r>
+      <w:proofErr w:type="gramStart"/>
+      <w:r>
+        <w:rPr>
+          <w:sz w:val="28"/>
+          <w:szCs w:val="28"/>
+        </w:rPr>
+        <w:t>Clarity:*</w:t>
+      </w:r>
+      <w:proofErr w:type="gramEnd"/>
+      <w:r>
+        <w:rPr>
+          <w:sz w:val="28"/>
+          <w:szCs w:val="28"/>
+        </w:rPr>
+        <w:t>* 8/10 - The prompt is easy to understand and has a clear goal: to act as a restaurant advisor providing a list of restaurants based on cuisine and location.</w:t>
+      </w:r>
+    </w:p>
+    <w:p>
+      <w:pPr>
+        <w:pStyle w:val="ListParagraph"/>
+        <w:rPr>
+          <w:sz w:val="28"/>
+          <w:szCs w:val="28"/>
+        </w:rPr>
+      </w:pPr>
+      <w:r>
+        <w:rPr>
+          <w:sz w:val="28"/>
+          <w:szCs w:val="28"/>
+        </w:rPr>
+        <w:t>2.  **Specificity/</w:t>
+      </w:r>
+      <w:proofErr w:type="gramStart"/>
+      <w:r>
+        <w:rPr>
+          <w:sz w:val="28"/>
+          <w:szCs w:val="28"/>
+        </w:rPr>
+        <w:t>Details:*</w:t>
+      </w:r>
+      <w:proofErr w:type="gramEnd"/>
+      <w:r>
+        <w:rPr>
+          <w:sz w:val="28"/>
+          <w:szCs w:val="28"/>
+        </w:rPr>
+        <w:t>* 4/10 - While it asks for cuisine and a 10-mile radius, it lacks crucial details. It doesn't specify *how* the cuisine and current location are provided by the user, how many restaurants to list, or the source/method for determining "best dishes."</w:t>
+      </w:r>
+    </w:p>
+    <w:p>
+      <w:pPr>
+        <w:pStyle w:val="ListParagraph"/>
+        <w:rPr>
+          <w:sz w:val="28"/>
+          <w:szCs w:val="28"/>
+        </w:rPr>
+      </w:pPr>
+      <w:r>
+        <w:rPr>
+          <w:sz w:val="28"/>
+          <w:szCs w:val="28"/>
+        </w:rPr>
+        <w:t>3.  **</w:t>
+      </w:r>
+      <w:proofErr w:type="gramStart"/>
+      <w:r>
+        <w:rPr>
+          <w:sz w:val="28"/>
+          <w:szCs w:val="28"/>
+        </w:rPr>
+        <w:t>Context:*</w:t>
+      </w:r>
+      <w:proofErr w:type="gramEnd"/>
+      <w:r>
+        <w:rPr>
+          <w:sz w:val="28"/>
+          <w:szCs w:val="28"/>
+        </w:rPr>
+        <w:t>* 5/10 - It establishes a basic context (restaurant advisor, user, 10-mile radius), but it could benefit from more background information, such as the user's preferences (e.g., budget, occasion, dietary restrictions) or the purpose of the recommendation.</w:t>
+      </w:r>
+    </w:p>
+    <w:p>
+      <w:pPr>
+        <w:pStyle w:val="ListParagraph"/>
+        <w:rPr>
+          <w:sz w:val="28"/>
+          <w:szCs w:val="28"/>
+        </w:rPr>
+      </w:pPr>
+      <w:r>
+        <w:rPr>
+          <w:sz w:val="28"/>
+          <w:szCs w:val="28"/>
+        </w:rPr>
+        <w:t xml:space="preserve">4.  **Output Format and </w:t>
+      </w:r>
+      <w:proofErr w:type="gramStart"/>
+      <w:r>
+        <w:rPr>
+          <w:sz w:val="28"/>
+          <w:szCs w:val="28"/>
+        </w:rPr>
+        <w:t>Constraints:*</w:t>
+      </w:r>
+      <w:proofErr w:type="gramEnd"/>
+      <w:r>
+        <w:rPr>
+          <w:sz w:val="28"/>
+          <w:szCs w:val="28"/>
+        </w:rPr>
+        <w:t>* 6/10 - It specifies *what* information to include (list of restaurants, rating, best dishes), which is good. However, it doesn't specify the *format* (e.g., bullet points, table, paragraph), the desired length, or the tone of the recommendations.</w:t>
+      </w:r>
+    </w:p>
+    <w:p>
+      <w:pPr>
+        <w:pStyle w:val="ListParagraph"/>
+        <w:rPr>
+          <w:sz w:val="28"/>
+          <w:szCs w:val="28"/>
+        </w:rPr>
+      </w:pPr>
+      <w:r>
+        <w:rPr>
+          <w:sz w:val="28"/>
+          <w:szCs w:val="28"/>
+        </w:rPr>
+        <w:t xml:space="preserve">5.  **Confirm if a prompt assigns a specific </w:t>
+      </w:r>
+      <w:proofErr w:type="gramStart"/>
+      <w:r>
+        <w:rPr>
+          <w:sz w:val="28"/>
+          <w:szCs w:val="28"/>
+        </w:rPr>
+        <w:t>role:*</w:t>
+      </w:r>
+      <w:proofErr w:type="gramEnd"/>
+      <w:r>
+        <w:rPr>
+          <w:sz w:val="28"/>
+          <w:szCs w:val="28"/>
+        </w:rPr>
+        <w:t>* 10/10 - The prompt clearly assigns the role "restaurant advisor."</w:t>
+      </w:r>
+    </w:p>
+    <w:p>
+      <w:pPr>
+        <w:pStyle w:val="ListParagraph"/>
+        <w:rPr>
+          <w:sz w:val="28"/>
+          <w:szCs w:val="28"/>
+        </w:rPr>
+      </w:pPr>
+    </w:p>
+    <w:p>
+      <w:pPr>
+        <w:pStyle w:val="ListParagraph"/>
+        <w:rPr>
+          <w:sz w:val="28"/>
+          <w:szCs w:val="28"/>
+        </w:rPr>
+      </w:pPr>
+      <w:r>
+        <w:rPr>
+          <w:sz w:val="28"/>
+          <w:szCs w:val="28"/>
+        </w:rPr>
+        <w:t xml:space="preserve">**Suggestions for improving the </w:t>
+      </w:r>
+      <w:proofErr w:type="gramStart"/>
+      <w:r>
+        <w:rPr>
+          <w:sz w:val="28"/>
+          <w:szCs w:val="28"/>
+        </w:rPr>
+        <w:t>prompt:*</w:t>
+      </w:r>
+      <w:proofErr w:type="gramEnd"/>
+      <w:r>
+        <w:rPr>
+          <w:sz w:val="28"/>
+          <w:szCs w:val="28"/>
+        </w:rPr>
+        <w:t>*</w:t>
+      </w:r>
+    </w:p>
+    <w:p>
+      <w:pPr>
+        <w:pStyle w:val="ListParagraph"/>
+        <w:rPr>
+          <w:sz w:val="28"/>
+          <w:szCs w:val="28"/>
+        </w:rPr>
+      </w:pPr>
+    </w:p>
+    <w:p>
+      <w:pPr>
+        <w:pStyle w:val="ListParagraph"/>
+        <w:rPr>
+          <w:sz w:val="28"/>
+          <w:szCs w:val="28"/>
+        </w:rPr>
+      </w:pPr>
+      <w:r>
+        <w:rPr>
+          <w:sz w:val="28"/>
+          <w:szCs w:val="28"/>
+        </w:rPr>
+        <w:t xml:space="preserve">1.  **Clarify Input </w:t>
+      </w:r>
+      <w:proofErr w:type="gramStart"/>
+      <w:r>
+        <w:rPr>
+          <w:sz w:val="28"/>
+          <w:szCs w:val="28"/>
+        </w:rPr>
+        <w:t>Mechanism:*</w:t>
+      </w:r>
+      <w:proofErr w:type="gramEnd"/>
+      <w:r>
+        <w:rPr>
+          <w:sz w:val="28"/>
+          <w:szCs w:val="28"/>
+        </w:rPr>
+        <w:t>* Specify how the "cuisine of the restaurant" and the user's current location (for the 10-mile radius) will be provided. For example, "The user will provide their desired cuisine and current address/zip code."</w:t>
+      </w:r>
+    </w:p>
+    <w:p>
+      <w:pPr>
+        <w:pStyle w:val="ListParagraph"/>
+        <w:rPr>
+          <w:sz w:val="28"/>
+          <w:szCs w:val="28"/>
+        </w:rPr>
+      </w:pPr>
+      <w:r>
+        <w:rPr>
+          <w:sz w:val="28"/>
+          <w:szCs w:val="28"/>
+        </w:rPr>
+        <w:t xml:space="preserve">2.  **Add Output Format </w:t>
+      </w:r>
+      <w:proofErr w:type="gramStart"/>
+      <w:r>
+        <w:rPr>
+          <w:sz w:val="28"/>
+          <w:szCs w:val="28"/>
+        </w:rPr>
+        <w:t>Details:*</w:t>
+      </w:r>
+      <w:proofErr w:type="gramEnd"/>
+      <w:r>
+        <w:rPr>
+          <w:sz w:val="28"/>
+          <w:szCs w:val="28"/>
+        </w:rPr>
+        <w:t>* Define the desired structure for the output. For instance, "Provide the list as bullet points, including the restaurant name, its rating (out of 5), and 2-3 best dishes for each."</w:t>
+      </w:r>
+    </w:p>
+    <w:p>
+      <w:pPr>
+        <w:pStyle w:val="ListParagraph"/>
+        <w:rPr>
+          <w:sz w:val="28"/>
+          <w:szCs w:val="28"/>
+        </w:rPr>
+      </w:pPr>
+      <w:r>
+        <w:rPr>
+          <w:sz w:val="28"/>
+          <w:szCs w:val="28"/>
+        </w:rPr>
+        <w:t>3.  **Include More User Preferences/</w:t>
+      </w:r>
+      <w:proofErr w:type="gramStart"/>
+      <w:r>
+        <w:rPr>
+          <w:sz w:val="28"/>
+          <w:szCs w:val="28"/>
+        </w:rPr>
+        <w:t>Constraints:*</w:t>
+      </w:r>
+      <w:proofErr w:type="gramEnd"/>
+      <w:r>
+        <w:rPr>
+          <w:sz w:val="28"/>
+          <w:szCs w:val="28"/>
+        </w:rPr>
+        <w:t>* To make the recommendations more relevant, ask for additional user preferences like budget, dining occasion (casual, fine dining), or specific dietary needs.</w:t>
+      </w:r>
+    </w:p>
+    <w:p>
+      <w:pPr>
+        <w:pStyle w:val="ListParagraph"/>
+      </w:pPr>
+    </w:p>
+    <w:p>
+      <w:pPr>
+        <w:pStyle w:val="ListParagraph"/>
+      </w:pPr>
+    </w:p>
+    <w:p>
+      <w:pPr>
+        <w:rPr>
+          <w:b/>
+          <w:bCs/>
+          <w:sz w:val="44"/>
+          <w:szCs w:val="44"/>
+        </w:rPr>
+      </w:pPr>
+      <w:r>
+        <w:rPr>
+          <w:b/>
+          <w:bCs/>
+          <w:sz w:val="44"/>
+          <w:szCs w:val="44"/>
+        </w:rPr>
+        <w:t>Test</w:t>
+      </w:r>
+      <w:r>
+        <w:rPr>
+          <w:b/>
+          <w:bCs/>
+          <w:sz w:val="44"/>
+          <w:szCs w:val="44"/>
+        </w:rPr>
+        <w:t>4</w:t>
+      </w:r>
+      <w:r>
+        <w:rPr>
+          <w:b/>
+          <w:bCs/>
+          <w:sz w:val="44"/>
+          <w:szCs w:val="44"/>
+        </w:rPr>
+        <w:t xml:space="preserve"> - Input</w:t>
+      </w:r>
+    </w:p>
+    <w:p>
+      <w:pPr>
+        <w:pStyle w:val="ListParagraph"/>
+      </w:pPr>
+    </w:p>
+    <w:p>
+      <w:pPr>
+        <w:rPr>
+          <w:sz w:val="28"/>
+          <w:szCs w:val="28"/>
+        </w:rPr>
+      </w:pPr>
+      <w:r>
+        <w:rPr>
+          <w:sz w:val="28"/>
+          <w:szCs w:val="28"/>
+        </w:rPr>
+        <w:t>Your name is KaapiAgent who suggest the type of coffee based on the user’s mood and time of the day.</w:t>
       </w:r>
     </w:p>
     <w:p/>
     <w:p>
       <w:pPr>
-        <w:pStyle w:val="ListParagraph"/>
-        <w:numPr>
-          <w:ilvl w:val="0"/>
-          <w:numId w:val="1"/>
-        </w:numPr>
-      </w:pPr>
-      <w:r>
-        <w:t xml:space="preserve">Your name is </w:t>
-      </w:r>
-      <w:proofErr w:type="spellStart"/>
-      <w:r>
-        <w:t>KaapiAgent</w:t>
-      </w:r>
-      <w:proofErr w:type="spellEnd"/>
-      <w:r>
-        <w:t xml:space="preserve"> who suggest the type of coffee based on the user’s mood and time of the day.</w:t>
-      </w:r>
-    </w:p>
-    <w:p>
-      <w:pPr>
-        <w:pStyle w:val="ListParagraph"/>
-      </w:pPr>
-    </w:p>
-    <w:p>
-      <w:pPr>
-        <w:pStyle w:val="ListParagraph"/>
-        <w:numPr>
-          <w:ilvl w:val="0"/>
-          <w:numId w:val="1"/>
-        </w:numPr>
-      </w:pPr>
-      <w:r>
-        <w:t xml:space="preserve">You name is </w:t>
-      </w:r>
-      <w:proofErr w:type="spellStart"/>
-      <w:r>
-        <w:t>Aryabhatta</w:t>
-      </w:r>
-      <w:proofErr w:type="spellEnd"/>
-      <w:r>
-        <w:t xml:space="preserve"> and you are an expert in astronomy and anything related to space and the universe. You will answer questions related to stars, planet and galaxies. The user will provide name of an astronomical object. The output should be the galaxy name and distance of the galaxy </w:t>
-      </w:r>
-      <w:r>
+        <w:rPr>
+          <w:b/>
+          <w:bCs/>
+          <w:sz w:val="44"/>
+          <w:szCs w:val="44"/>
+        </w:rPr>
+      </w:pPr>
+      <w:r>
+        <w:rPr>
+          <w:b/>
+          <w:bCs/>
+          <w:sz w:val="44"/>
+          <w:szCs w:val="44"/>
+        </w:rPr>
+        <w:t xml:space="preserve">Test4 </w:t>
+      </w:r>
+      <w:r>
+        <w:rPr>
+          <w:b/>
+          <w:bCs/>
+          <w:sz w:val="44"/>
+          <w:szCs w:val="44"/>
+        </w:rPr>
+        <w:t>–</w:t>
+      </w:r>
+      <w:r>
+        <w:rPr>
+          <w:b/>
+          <w:bCs/>
+          <w:sz w:val="44"/>
+          <w:szCs w:val="44"/>
+        </w:rPr>
+        <w:t xml:space="preserve"> Output</w:t>
+      </w:r>
+    </w:p>
+    <w:p>
+      <w:pPr>
+        <w:rPr>
+          <w:b/>
+          <w:bCs/>
+          <w:sz w:val="44"/>
+          <w:szCs w:val="44"/>
+        </w:rPr>
+      </w:pPr>
+    </w:p>
+    <w:p>
+      <w:pPr>
+        <w:pStyle w:val="ListParagraph"/>
+        <w:rPr>
+          <w:sz w:val="28"/>
+          <w:szCs w:val="28"/>
+        </w:rPr>
+      </w:pPr>
+      <w:r>
+        <w:rPr>
+          <w:sz w:val="28"/>
+          <w:szCs w:val="28"/>
+        </w:rPr>
+        <w:t>**Final Score: 5.2/10**</w:t>
+      </w:r>
+    </w:p>
+    <w:p>
+      <w:pPr>
+        <w:pStyle w:val="ListParagraph"/>
+        <w:rPr>
+          <w:sz w:val="28"/>
+          <w:szCs w:val="28"/>
+        </w:rPr>
+      </w:pPr>
+    </w:p>
+    <w:p>
+      <w:pPr>
+        <w:pStyle w:val="ListParagraph"/>
+        <w:rPr>
+          <w:sz w:val="28"/>
+          <w:szCs w:val="28"/>
+        </w:rPr>
+      </w:pPr>
+      <w:r>
+        <w:rPr>
+          <w:sz w:val="28"/>
+          <w:szCs w:val="28"/>
+        </w:rPr>
+        <w:t xml:space="preserve">**Scores for each Quality </w:t>
+      </w:r>
+      <w:proofErr w:type="gramStart"/>
+      <w:r>
+        <w:rPr>
+          <w:sz w:val="28"/>
+          <w:szCs w:val="28"/>
+        </w:rPr>
+        <w:t>Criterion:*</w:t>
+      </w:r>
+      <w:proofErr w:type="gramEnd"/>
+      <w:r>
+        <w:rPr>
+          <w:sz w:val="28"/>
+          <w:szCs w:val="28"/>
+        </w:rPr>
+        <w:t>*</w:t>
+      </w:r>
+    </w:p>
+    <w:p>
+      <w:pPr>
+        <w:pStyle w:val="ListParagraph"/>
+        <w:rPr>
+          <w:sz w:val="28"/>
+          <w:szCs w:val="28"/>
+        </w:rPr>
+      </w:pPr>
+    </w:p>
+    <w:p>
+      <w:pPr>
+        <w:pStyle w:val="ListParagraph"/>
+        <w:rPr>
+          <w:sz w:val="28"/>
+          <w:szCs w:val="28"/>
+        </w:rPr>
+      </w:pPr>
+      <w:r>
+        <w:rPr>
+          <w:sz w:val="28"/>
+          <w:szCs w:val="28"/>
+        </w:rPr>
+        <w:t xml:space="preserve">1.  **Clarity of </w:t>
+      </w:r>
+      <w:proofErr w:type="gramStart"/>
+      <w:r>
+        <w:rPr>
+          <w:sz w:val="28"/>
+          <w:szCs w:val="28"/>
+        </w:rPr>
+        <w:t>prompt:*</w:t>
+      </w:r>
+      <w:proofErr w:type="gramEnd"/>
+      <w:r>
+        <w:rPr>
+          <w:sz w:val="28"/>
+          <w:szCs w:val="28"/>
+        </w:rPr>
+        <w:t>* 9/10</w:t>
+      </w:r>
+    </w:p>
+    <w:p>
+      <w:pPr>
+        <w:pStyle w:val="ListParagraph"/>
+        <w:rPr>
+          <w:sz w:val="28"/>
+          <w:szCs w:val="28"/>
+        </w:rPr>
+      </w:pPr>
+      <w:r>
+        <w:rPr>
+          <w:sz w:val="28"/>
+          <w:szCs w:val="28"/>
+        </w:rPr>
+        <w:t xml:space="preserve">    *   **</w:t>
+      </w:r>
+      <w:proofErr w:type="gramStart"/>
+      <w:r>
+        <w:rPr>
+          <w:sz w:val="28"/>
+          <w:szCs w:val="28"/>
+        </w:rPr>
+        <w:t>Explanation:*</w:t>
+      </w:r>
+      <w:proofErr w:type="gramEnd"/>
+      <w:r>
+        <w:rPr>
+          <w:sz w:val="28"/>
+          <w:szCs w:val="28"/>
+        </w:rPr>
+        <w:t>* The prompt is very clear in its goal: to suggest coffee based on mood and time of day, and it clearly assigns a name and role.</w:t>
+      </w:r>
+    </w:p>
+    <w:p>
+      <w:pPr>
+        <w:pStyle w:val="ListParagraph"/>
+        <w:rPr>
+          <w:sz w:val="28"/>
+          <w:szCs w:val="28"/>
+        </w:rPr>
+      </w:pPr>
+      <w:r>
+        <w:rPr>
+          <w:sz w:val="28"/>
+          <w:szCs w:val="28"/>
+        </w:rPr>
+        <w:t>2.  **Specificity/</w:t>
+      </w:r>
+      <w:proofErr w:type="gramStart"/>
+      <w:r>
+        <w:rPr>
+          <w:sz w:val="28"/>
+          <w:szCs w:val="28"/>
+        </w:rPr>
+        <w:t>Details:*</w:t>
+      </w:r>
+      <w:proofErr w:type="gramEnd"/>
+      <w:r>
+        <w:rPr>
+          <w:sz w:val="28"/>
+          <w:szCs w:val="28"/>
+        </w:rPr>
+        <w:t>* 4/10</w:t>
+      </w:r>
+    </w:p>
+    <w:p>
+      <w:pPr>
+        <w:pStyle w:val="ListParagraph"/>
+        <w:rPr>
+          <w:sz w:val="28"/>
+          <w:szCs w:val="28"/>
+        </w:rPr>
+      </w:pPr>
+      <w:r>
+        <w:rPr>
+          <w:sz w:val="28"/>
+          <w:szCs w:val="28"/>
+        </w:rPr>
+        <w:t xml:space="preserve">    *   **</w:t>
+      </w:r>
+      <w:proofErr w:type="gramStart"/>
+      <w:r>
+        <w:rPr>
+          <w:sz w:val="28"/>
+          <w:szCs w:val="28"/>
+        </w:rPr>
+        <w:t>Explanation:*</w:t>
+      </w:r>
+      <w:proofErr w:type="gramEnd"/>
+      <w:r>
+        <w:rPr>
+          <w:sz w:val="28"/>
+          <w:szCs w:val="28"/>
+        </w:rPr>
+        <w:t>* While it specifies *what* to suggest (coffee type) and *what to base it on* (mood, time), it lacks details on *how* to suggest, what specific coffee types to consider, or what range of moods/times are relevant.</w:t>
+      </w:r>
+    </w:p>
+    <w:p>
+      <w:pPr>
+        <w:pStyle w:val="ListParagraph"/>
+        <w:rPr>
+          <w:sz w:val="28"/>
+          <w:szCs w:val="28"/>
+        </w:rPr>
+      </w:pPr>
+      <w:r>
+        <w:rPr>
+          <w:sz w:val="28"/>
+          <w:szCs w:val="28"/>
+        </w:rPr>
+        <w:t>3.  **</w:t>
+      </w:r>
+      <w:proofErr w:type="gramStart"/>
+      <w:r>
+        <w:rPr>
+          <w:sz w:val="28"/>
+          <w:szCs w:val="28"/>
+        </w:rPr>
+        <w:t>Context:*</w:t>
+      </w:r>
+      <w:proofErr w:type="gramEnd"/>
+      <w:r>
+        <w:rPr>
+          <w:sz w:val="28"/>
+          <w:szCs w:val="28"/>
+        </w:rPr>
+        <w:t>* 2/10</w:t>
+      </w:r>
+    </w:p>
+    <w:p>
+      <w:pPr>
+        <w:pStyle w:val="ListParagraph"/>
+        <w:rPr>
+          <w:sz w:val="28"/>
+          <w:szCs w:val="28"/>
+        </w:rPr>
+      </w:pPr>
+      <w:r>
+        <w:rPr>
+          <w:sz w:val="28"/>
+          <w:szCs w:val="28"/>
+        </w:rPr>
+        <w:t xml:space="preserve">    *   **</w:t>
+      </w:r>
+      <w:proofErr w:type="gramStart"/>
+      <w:r>
+        <w:rPr>
+          <w:sz w:val="28"/>
+          <w:szCs w:val="28"/>
+        </w:rPr>
+        <w:t>Explanation:*</w:t>
+      </w:r>
+      <w:proofErr w:type="gramEnd"/>
+      <w:r>
+        <w:rPr>
+          <w:sz w:val="28"/>
+          <w:szCs w:val="28"/>
+        </w:rPr>
+        <w:t>* There is minimal context. It doesn't mention the background of KaapiAgent (e.g., is it a barista, a coffee expert?), the target audience, or the specific use case for these suggestions.</w:t>
+      </w:r>
+    </w:p>
+    <w:p>
+      <w:pPr>
+        <w:pStyle w:val="ListParagraph"/>
+        <w:rPr>
+          <w:sz w:val="28"/>
+          <w:szCs w:val="28"/>
+        </w:rPr>
+      </w:pPr>
+      <w:r>
+        <w:rPr>
+          <w:sz w:val="28"/>
+          <w:szCs w:val="28"/>
+        </w:rPr>
+        <w:t xml:space="preserve">4.  **Output Format and </w:t>
+      </w:r>
+      <w:proofErr w:type="gramStart"/>
+      <w:r>
+        <w:rPr>
+          <w:sz w:val="28"/>
+          <w:szCs w:val="28"/>
+        </w:rPr>
+        <w:t>constraints:*</w:t>
+      </w:r>
+      <w:proofErr w:type="gramEnd"/>
+      <w:r>
+        <w:rPr>
+          <w:sz w:val="28"/>
+          <w:szCs w:val="28"/>
+        </w:rPr>
+        <w:t>* 1/10</w:t>
+      </w:r>
+    </w:p>
+    <w:p>
+      <w:pPr>
+        <w:pStyle w:val="ListParagraph"/>
+        <w:rPr>
+          <w:sz w:val="28"/>
+          <w:szCs w:val="28"/>
+        </w:rPr>
+      </w:pPr>
+      <w:r>
+        <w:rPr>
+          <w:sz w:val="28"/>
+          <w:szCs w:val="28"/>
+        </w:rPr>
+        <w:t xml:space="preserve">    *   **</w:t>
+      </w:r>
+      <w:proofErr w:type="gramStart"/>
+      <w:r>
+        <w:rPr>
+          <w:sz w:val="28"/>
+          <w:szCs w:val="28"/>
+        </w:rPr>
+        <w:t>Explanation:*</w:t>
+      </w:r>
+      <w:proofErr w:type="gramEnd"/>
+      <w:r>
+        <w:rPr>
+          <w:sz w:val="28"/>
+          <w:szCs w:val="28"/>
+        </w:rPr>
+        <w:t>* No output format is specified (e.g., just the name of the coffee, a description, a reason), nor are there any constraints on tone, length, or style of the suggestion.</w:t>
+      </w:r>
+    </w:p>
+    <w:p>
+      <w:pPr>
+        <w:pStyle w:val="ListParagraph"/>
+        <w:rPr>
+          <w:sz w:val="28"/>
+          <w:szCs w:val="28"/>
+        </w:rPr>
+      </w:pPr>
+      <w:r>
+        <w:rPr>
+          <w:sz w:val="28"/>
+          <w:szCs w:val="28"/>
+        </w:rPr>
+        <w:t xml:space="preserve">5.  **Confirm if a prompt assigns a specific </w:t>
+      </w:r>
+      <w:proofErr w:type="gramStart"/>
+      <w:r>
+        <w:rPr>
+          <w:sz w:val="28"/>
+          <w:szCs w:val="28"/>
+        </w:rPr>
+        <w:t>role:*</w:t>
+      </w:r>
+      <w:proofErr w:type="gramEnd"/>
+      <w:r>
+        <w:rPr>
+          <w:sz w:val="28"/>
+          <w:szCs w:val="28"/>
+        </w:rPr>
+        <w:t>* 10/10</w:t>
+      </w:r>
+    </w:p>
+    <w:p>
+      <w:pPr>
+        <w:pStyle w:val="ListParagraph"/>
+        <w:rPr>
+          <w:sz w:val="28"/>
+          <w:szCs w:val="28"/>
+        </w:rPr>
+      </w:pPr>
+      <w:r>
+        <w:rPr>
+          <w:sz w:val="28"/>
+          <w:szCs w:val="28"/>
+        </w:rPr>
+        <w:t xml:space="preserve">    *   **</w:t>
+      </w:r>
+      <w:proofErr w:type="gramStart"/>
+      <w:r>
+        <w:rPr>
+          <w:sz w:val="28"/>
+          <w:szCs w:val="28"/>
+        </w:rPr>
+        <w:t>Explanation:*</w:t>
+      </w:r>
+      <w:proofErr w:type="gramEnd"/>
+      <w:r>
+        <w:rPr>
+          <w:sz w:val="28"/>
+          <w:szCs w:val="28"/>
+        </w:rPr>
+        <w:t>* The prompt explicitly assigns a name ("KaapiAgent") and a clear role ("who suggest the type of coffee based on the user’s mood and time of the day").</w:t>
+      </w:r>
+    </w:p>
+    <w:p>
+      <w:pPr>
+        <w:pStyle w:val="ListParagraph"/>
+        <w:rPr>
+          <w:sz w:val="28"/>
+          <w:szCs w:val="28"/>
+        </w:rPr>
+      </w:pPr>
+    </w:p>
+    <w:p>
+      <w:pPr>
+        <w:pStyle w:val="ListParagraph"/>
+        <w:rPr>
+          <w:sz w:val="28"/>
+          <w:szCs w:val="28"/>
+        </w:rPr>
+      </w:pPr>
+      <w:r>
+        <w:rPr>
+          <w:sz w:val="28"/>
+          <w:szCs w:val="28"/>
+        </w:rPr>
+        <w:t xml:space="preserve">**Suggestions for improving the </w:t>
+      </w:r>
+      <w:proofErr w:type="gramStart"/>
+      <w:r>
+        <w:rPr>
+          <w:sz w:val="28"/>
+          <w:szCs w:val="28"/>
+        </w:rPr>
+        <w:t>prompt:*</w:t>
+      </w:r>
+      <w:proofErr w:type="gramEnd"/>
+      <w:r>
+        <w:rPr>
+          <w:sz w:val="28"/>
+          <w:szCs w:val="28"/>
+        </w:rPr>
+        <w:t>*</w:t>
+      </w:r>
+    </w:p>
+    <w:p>
+      <w:pPr>
+        <w:pStyle w:val="ListParagraph"/>
+        <w:rPr>
+          <w:sz w:val="28"/>
+          <w:szCs w:val="28"/>
+        </w:rPr>
+      </w:pPr>
+    </w:p>
+    <w:p>
+      <w:pPr>
+        <w:pStyle w:val="ListParagraph"/>
+        <w:rPr>
+          <w:sz w:val="28"/>
+          <w:szCs w:val="28"/>
+        </w:rPr>
+      </w:pPr>
+      <w:r>
+        <w:rPr>
+          <w:sz w:val="28"/>
+          <w:szCs w:val="28"/>
+        </w:rPr>
+        <w:t xml:space="preserve">1.  **Specify Output Format and </w:t>
+      </w:r>
+      <w:proofErr w:type="gramStart"/>
+      <w:r>
+        <w:rPr>
+          <w:sz w:val="28"/>
+          <w:szCs w:val="28"/>
+        </w:rPr>
+        <w:t>Tone:*</w:t>
+      </w:r>
+      <w:proofErr w:type="gramEnd"/>
+      <w:r>
+        <w:rPr>
+          <w:sz w:val="28"/>
+          <w:szCs w:val="28"/>
+        </w:rPr>
+        <w:t>* Clearly define how KaapiAgent should present its suggestions (e.g., "Suggest a coffee with a brief explanation of why it fits the mood and time, in a friendly and encouraging tone. Keep the suggestion to 2-3 sentences.").</w:t>
+      </w:r>
+    </w:p>
+    <w:p>
+      <w:pPr>
+        <w:pStyle w:val="ListParagraph"/>
+        <w:rPr>
+          <w:sz w:val="28"/>
+          <w:szCs w:val="28"/>
+        </w:rPr>
+      </w:pPr>
+      <w:r>
+        <w:rPr>
+          <w:sz w:val="28"/>
+          <w:szCs w:val="28"/>
+        </w:rPr>
+        <w:lastRenderedPageBreak/>
+        <w:t>2.  **Add More Specificity for Coffee Types, Moods, and Times:** Provide examples or categories for the types of coffee KaapiAgent can suggest (e.g., "Consider espresso-based drinks, filter coffee, cold brews, and decaf options."), moods (e.g., "tired, energetic, relaxed, stressed, focused"), and how to interpret time of day (e.g., "morning, afternoon, evening, late night").</w:t>
+      </w:r>
+    </w:p>
+    <w:p>
+      <w:pPr>
+        <w:pStyle w:val="ListParagraph"/>
+        <w:rPr>
+          <w:sz w:val="28"/>
+          <w:szCs w:val="28"/>
+        </w:rPr>
+      </w:pPr>
+      <w:r>
+        <w:rPr>
+          <w:sz w:val="28"/>
+          <w:szCs w:val="28"/>
+        </w:rPr>
+        <w:t xml:space="preserve">3.  **Provide Context for KaapiAgent's </w:t>
+      </w:r>
+      <w:proofErr w:type="gramStart"/>
+      <w:r>
+        <w:rPr>
+          <w:sz w:val="28"/>
+          <w:szCs w:val="28"/>
+        </w:rPr>
+        <w:t>Persona:*</w:t>
+      </w:r>
+      <w:proofErr w:type="gramEnd"/>
+      <w:r>
+        <w:rPr>
+          <w:sz w:val="28"/>
+          <w:szCs w:val="28"/>
+        </w:rPr>
+        <w:t>* Briefly describe KaapiAgent's expertise or personality (e.g., "KaapiAgent is a knowledgeable and enthusiastic virtual barista...") to guide its responses and make the interaction more engaging.</w:t>
+      </w:r>
+    </w:p>
+    <w:p>
+      <w:pPr>
+        <w:pStyle w:val="ListParagraph"/>
+      </w:pPr>
+    </w:p>
+    <w:p>
+      <w:pPr>
+        <w:pStyle w:val="ListParagraph"/>
+      </w:pPr>
+    </w:p>
+    <w:p>
+      <w:pPr>
+        <w:rPr>
+          <w:b/>
+          <w:bCs/>
+          <w:sz w:val="44"/>
+          <w:szCs w:val="44"/>
+        </w:rPr>
+      </w:pPr>
+      <w:r>
+        <w:rPr>
+          <w:b/>
+          <w:bCs/>
+          <w:sz w:val="44"/>
+          <w:szCs w:val="44"/>
+        </w:rPr>
+        <w:t>Test</w:t>
+      </w:r>
+      <w:r>
+        <w:rPr>
+          <w:b/>
+          <w:bCs/>
+          <w:sz w:val="44"/>
+          <w:szCs w:val="44"/>
+        </w:rPr>
+        <w:t>5</w:t>
+      </w:r>
+      <w:r>
+        <w:rPr>
+          <w:b/>
+          <w:bCs/>
+          <w:sz w:val="44"/>
+          <w:szCs w:val="44"/>
+        </w:rPr>
+        <w:t xml:space="preserve"> - Input</w:t>
+      </w:r>
+    </w:p>
+    <w:p>
+      <w:pPr>
+        <w:pStyle w:val="ListParagraph"/>
+      </w:pPr>
+    </w:p>
+    <w:p>
+      <w:pPr>
+        <w:pStyle w:val="ListParagraph"/>
+        <w:rPr>
+          <w:sz w:val="28"/>
+          <w:szCs w:val="28"/>
+        </w:rPr>
+      </w:pPr>
+      <w:r>
+        <w:rPr>
+          <w:sz w:val="28"/>
+          <w:szCs w:val="28"/>
+        </w:rPr>
+        <w:t xml:space="preserve">You name is Aryabhatta and you are an expert in astronomy and anything related to space and the universe. You will answer questions related to stars, planet and galaxies. The user will provide name of an astronomical object. The output should be the galaxy name and distance of the galaxy </w:t>
+      </w:r>
+      <w:r>
+        <w:rPr>
+          <w:sz w:val="28"/>
+          <w:szCs w:val="28"/>
+        </w:rPr>
         <w:t>from Earth</w:t>
       </w:r>
     </w:p>
-    <w:p>
-      <w:pPr>
-        <w:pStyle w:val="ListParagraph"/>
-      </w:pPr>
-    </w:p>
-    <w:p>
-      <w:pPr>
-        <w:pStyle w:val="ListParagraph"/>
-        <w:numPr>
-          <w:ilvl w:val="0"/>
-          <w:numId w:val="1"/>
-        </w:numPr>
-      </w:pPr>
-      <w:r>
+    <w:p/>
+    <w:p>
+      <w:pPr>
+        <w:rPr>
+          <w:b/>
+          <w:bCs/>
+          <w:sz w:val="44"/>
+          <w:szCs w:val="44"/>
+        </w:rPr>
+      </w:pPr>
+      <w:r>
+        <w:rPr>
+          <w:b/>
+          <w:bCs/>
+          <w:sz w:val="44"/>
+          <w:szCs w:val="44"/>
+        </w:rPr>
+        <w:t>Test5 - Output</w:t>
+      </w:r>
+    </w:p>
+    <w:p>
+      <w:pPr>
+        <w:pStyle w:val="ListParagraph"/>
+        <w:rPr>
+          <w:sz w:val="28"/>
+          <w:szCs w:val="28"/>
+        </w:rPr>
+      </w:pPr>
+    </w:p>
+    <w:p>
+      <w:pPr>
+        <w:pStyle w:val="ListParagraph"/>
+        <w:rPr>
+          <w:sz w:val="28"/>
+          <w:szCs w:val="28"/>
+        </w:rPr>
+      </w:pPr>
+      <w:r>
+        <w:rPr>
+          <w:sz w:val="28"/>
+          <w:szCs w:val="28"/>
+        </w:rPr>
+        <w:t>**Final Score: 8.2/10**</w:t>
+      </w:r>
+    </w:p>
+    <w:p>
+      <w:pPr>
+        <w:pStyle w:val="ListParagraph"/>
+        <w:rPr>
+          <w:sz w:val="28"/>
+          <w:szCs w:val="28"/>
+        </w:rPr>
+      </w:pPr>
+    </w:p>
+    <w:p>
+      <w:pPr>
+        <w:pStyle w:val="ListParagraph"/>
+        <w:rPr>
+          <w:sz w:val="28"/>
+          <w:szCs w:val="28"/>
+        </w:rPr>
+      </w:pPr>
+      <w:r>
+        <w:rPr>
+          <w:sz w:val="28"/>
+          <w:szCs w:val="28"/>
+        </w:rPr>
+        <w:t xml:space="preserve">**Scores for each Quality </w:t>
+      </w:r>
+      <w:proofErr w:type="gramStart"/>
+      <w:r>
+        <w:rPr>
+          <w:sz w:val="28"/>
+          <w:szCs w:val="28"/>
+        </w:rPr>
+        <w:t>Criterion:*</w:t>
+      </w:r>
+      <w:proofErr w:type="gramEnd"/>
+      <w:r>
+        <w:rPr>
+          <w:sz w:val="28"/>
+          <w:szCs w:val="28"/>
+        </w:rPr>
+        <w:t>*</w:t>
+      </w:r>
+    </w:p>
+    <w:p>
+      <w:pPr>
+        <w:pStyle w:val="ListParagraph"/>
+        <w:rPr>
+          <w:sz w:val="28"/>
+          <w:szCs w:val="28"/>
+        </w:rPr>
+      </w:pPr>
+    </w:p>
+    <w:p>
+      <w:pPr>
+        <w:pStyle w:val="ListParagraph"/>
+        <w:rPr>
+          <w:sz w:val="28"/>
+          <w:szCs w:val="28"/>
+        </w:rPr>
+      </w:pPr>
+      <w:r>
+        <w:rPr>
+          <w:sz w:val="28"/>
+          <w:szCs w:val="28"/>
+        </w:rPr>
+        <w:t>1.  **Clarity of prompt: 9/10**</w:t>
+      </w:r>
+    </w:p>
+    <w:p>
+      <w:pPr>
+        <w:pStyle w:val="ListParagraph"/>
+        <w:rPr>
+          <w:sz w:val="28"/>
+          <w:szCs w:val="28"/>
+        </w:rPr>
+      </w:pPr>
+      <w:r>
+        <w:rPr>
+          <w:sz w:val="28"/>
+          <w:szCs w:val="28"/>
+        </w:rPr>
+        <w:t xml:space="preserve">    *   **</w:t>
+      </w:r>
+      <w:proofErr w:type="gramStart"/>
+      <w:r>
+        <w:rPr>
+          <w:sz w:val="28"/>
+          <w:szCs w:val="28"/>
+        </w:rPr>
+        <w:t>Explanation:*</w:t>
+      </w:r>
+      <w:proofErr w:type="gramEnd"/>
+      <w:r>
+        <w:rPr>
+          <w:sz w:val="28"/>
+          <w:szCs w:val="28"/>
+        </w:rPr>
+        <w:t>* The prompt is very easy to understand. It clearly states the AI's role, its domain of expertise, and the general type of questions it will answer. The desired output format is also clearly stated.</w:t>
+      </w:r>
+    </w:p>
+    <w:p>
+      <w:pPr>
+        <w:pStyle w:val="ListParagraph"/>
+        <w:rPr>
+          <w:sz w:val="28"/>
+          <w:szCs w:val="28"/>
+        </w:rPr>
+      </w:pPr>
+    </w:p>
+    <w:p>
+      <w:pPr>
+        <w:pStyle w:val="ListParagraph"/>
+        <w:rPr>
+          <w:sz w:val="28"/>
+          <w:szCs w:val="28"/>
+        </w:rPr>
+      </w:pPr>
+      <w:r>
+        <w:rPr>
+          <w:sz w:val="28"/>
+          <w:szCs w:val="28"/>
+        </w:rPr>
+        <w:t>2.  **Specificity/Details: 6/10**</w:t>
+      </w:r>
+    </w:p>
+    <w:p>
+      <w:pPr>
+        <w:pStyle w:val="ListParagraph"/>
+        <w:rPr>
+          <w:sz w:val="28"/>
+          <w:szCs w:val="28"/>
+        </w:rPr>
+      </w:pPr>
+      <w:r>
+        <w:rPr>
+          <w:sz w:val="28"/>
+          <w:szCs w:val="28"/>
+        </w:rPr>
+        <w:t xml:space="preserve">    *   **</w:t>
+      </w:r>
+      <w:proofErr w:type="gramStart"/>
+      <w:r>
+        <w:rPr>
+          <w:sz w:val="28"/>
+          <w:szCs w:val="28"/>
+        </w:rPr>
+        <w:t>Explanation:*</w:t>
+      </w:r>
+      <w:proofErr w:type="gramEnd"/>
+      <w:r>
+        <w:rPr>
+          <w:sz w:val="28"/>
+          <w:szCs w:val="28"/>
+        </w:rPr>
+        <w:t xml:space="preserve">* While the prompt specifies the input (name of an astronomical object) and the desired output (galaxy name and distance), there's a logical inconsistency. It states the user will provide "an </w:t>
+      </w:r>
+      <w:r>
+        <w:rPr>
+          <w:sz w:val="28"/>
+          <w:szCs w:val="28"/>
+        </w:rPr>
+        <w:lastRenderedPageBreak/>
+        <w:t>astronomical object" but then strictly requires the output to be a "galaxy name and distance." This lacks specificity on how to handle inputs that are not galaxies (e.g., if the user provides a star or planet name).</w:t>
+      </w:r>
+    </w:p>
+    <w:p>
+      <w:pPr>
+        <w:pStyle w:val="ListParagraph"/>
+        <w:rPr>
+          <w:sz w:val="28"/>
+          <w:szCs w:val="28"/>
+        </w:rPr>
+      </w:pPr>
+    </w:p>
+    <w:p>
+      <w:pPr>
+        <w:pStyle w:val="ListParagraph"/>
+        <w:rPr>
+          <w:sz w:val="28"/>
+          <w:szCs w:val="28"/>
+        </w:rPr>
+      </w:pPr>
+      <w:r>
+        <w:rPr>
+          <w:sz w:val="28"/>
+          <w:szCs w:val="28"/>
+        </w:rPr>
+        <w:t>3.  **Context: 8/10**</w:t>
+      </w:r>
+    </w:p>
+    <w:p>
+      <w:pPr>
+        <w:pStyle w:val="ListParagraph"/>
+        <w:rPr>
+          <w:sz w:val="28"/>
+          <w:szCs w:val="28"/>
+        </w:rPr>
+      </w:pPr>
+      <w:r>
+        <w:rPr>
+          <w:sz w:val="28"/>
+          <w:szCs w:val="28"/>
+        </w:rPr>
+        <w:t xml:space="preserve">    *   **</w:t>
+      </w:r>
+      <w:proofErr w:type="gramStart"/>
+      <w:r>
+        <w:rPr>
+          <w:sz w:val="28"/>
+          <w:szCs w:val="28"/>
+        </w:rPr>
+        <w:t>Explanation:*</w:t>
+      </w:r>
+      <w:proofErr w:type="gramEnd"/>
+      <w:r>
+        <w:rPr>
+          <w:sz w:val="28"/>
+          <w:szCs w:val="28"/>
+        </w:rPr>
+        <w:t>* The prompt provides good context by assigning a specific persona (Aryabhatta) and clearly defining the AI's expertise (astronomy, space, universe). This sets the stage well for the type of information expected.</w:t>
+      </w:r>
+    </w:p>
+    <w:p>
+      <w:pPr>
+        <w:pStyle w:val="ListParagraph"/>
+        <w:rPr>
+          <w:sz w:val="28"/>
+          <w:szCs w:val="28"/>
+        </w:rPr>
+      </w:pPr>
+    </w:p>
+    <w:p>
+      <w:pPr>
+        <w:pStyle w:val="ListParagraph"/>
+        <w:rPr>
+          <w:sz w:val="28"/>
+          <w:szCs w:val="28"/>
+        </w:rPr>
+      </w:pPr>
+      <w:r>
+        <w:rPr>
+          <w:sz w:val="28"/>
+          <w:szCs w:val="28"/>
+        </w:rPr>
+        <w:t>4.  **Output Format and constraints: 8/10**</w:t>
+      </w:r>
+    </w:p>
+    <w:p>
+      <w:pPr>
+        <w:pStyle w:val="ListParagraph"/>
+        <w:rPr>
+          <w:sz w:val="28"/>
+          <w:szCs w:val="28"/>
+        </w:rPr>
+      </w:pPr>
+      <w:r>
+        <w:rPr>
+          <w:sz w:val="28"/>
+          <w:szCs w:val="28"/>
+        </w:rPr>
+        <w:t xml:space="preserve">    *   **</w:t>
+      </w:r>
+      <w:proofErr w:type="gramStart"/>
+      <w:r>
+        <w:rPr>
+          <w:sz w:val="28"/>
+          <w:szCs w:val="28"/>
+        </w:rPr>
+        <w:t>Explanation:*</w:t>
+      </w:r>
+      <w:proofErr w:type="gramEnd"/>
+      <w:r>
+        <w:rPr>
+          <w:sz w:val="28"/>
+          <w:szCs w:val="28"/>
+        </w:rPr>
+        <w:t>* The expected output format ("galaxy name and distance of the galaxy from Earth") is clearly specified. However, it could be improved by specifying units for the distance (e.g., light-years, parsecs) and potentially a desired tone or conciseness.</w:t>
+      </w:r>
+    </w:p>
+    <w:p>
+      <w:pPr>
+        <w:pStyle w:val="ListParagraph"/>
+        <w:rPr>
+          <w:sz w:val="28"/>
+          <w:szCs w:val="28"/>
+        </w:rPr>
+      </w:pPr>
+    </w:p>
+    <w:p>
+      <w:pPr>
+        <w:pStyle w:val="ListParagraph"/>
+        <w:rPr>
+          <w:sz w:val="28"/>
+          <w:szCs w:val="28"/>
+        </w:rPr>
+      </w:pPr>
+      <w:r>
+        <w:rPr>
+          <w:sz w:val="28"/>
+          <w:szCs w:val="28"/>
+        </w:rPr>
+        <w:t>5.  **Confirm if a prompt assigns a specific role: 10/10**</w:t>
+      </w:r>
+    </w:p>
+    <w:p>
+      <w:pPr>
+        <w:pStyle w:val="ListParagraph"/>
+        <w:rPr>
+          <w:sz w:val="28"/>
+          <w:szCs w:val="28"/>
+        </w:rPr>
+      </w:pPr>
+      <w:r>
+        <w:rPr>
+          <w:sz w:val="28"/>
+          <w:szCs w:val="28"/>
+        </w:rPr>
+        <w:t xml:space="preserve">    *   **</w:t>
+      </w:r>
+      <w:proofErr w:type="gramStart"/>
+      <w:r>
+        <w:rPr>
+          <w:sz w:val="28"/>
+          <w:szCs w:val="28"/>
+        </w:rPr>
+        <w:t>Explanation:*</w:t>
+      </w:r>
+      <w:proofErr w:type="gramEnd"/>
+      <w:r>
+        <w:rPr>
+          <w:sz w:val="28"/>
+          <w:szCs w:val="28"/>
+        </w:rPr>
+        <w:t>* A very clear and specific role is assigned: "Aryabhatta," an "expert in astronomy and anything related to space and the universe."</w:t>
+      </w:r>
+    </w:p>
+    <w:p>
+      <w:pPr>
+        <w:pStyle w:val="ListParagraph"/>
+      </w:pPr>
+    </w:p>
+    <w:p>
+      <w:pPr>
+        <w:pStyle w:val="ListParagraph"/>
+      </w:pPr>
+    </w:p>
+    <w:p>
+      <w:pPr>
+        <w:pStyle w:val="ListParagraph"/>
+      </w:pPr>
+    </w:p>
+    <w:p>
+      <w:pPr>
+        <w:rPr>
+          <w:b/>
+          <w:bCs/>
+          <w:sz w:val="44"/>
+          <w:szCs w:val="44"/>
+        </w:rPr>
+      </w:pPr>
+      <w:r>
+        <w:rPr>
+          <w:b/>
+          <w:bCs/>
+          <w:sz w:val="44"/>
+          <w:szCs w:val="44"/>
+        </w:rPr>
+        <w:t>Test</w:t>
+      </w:r>
+      <w:r>
+        <w:rPr>
+          <w:b/>
+          <w:bCs/>
+          <w:sz w:val="44"/>
+          <w:szCs w:val="44"/>
+        </w:rPr>
+        <w:t>6</w:t>
+      </w:r>
+      <w:r>
+        <w:rPr>
+          <w:b/>
+          <w:bCs/>
+          <w:sz w:val="44"/>
+          <w:szCs w:val="44"/>
+        </w:rPr>
+        <w:t xml:space="preserve"> - Input</w:t>
+      </w:r>
+    </w:p>
+    <w:p>
+      <w:pPr>
+        <w:pStyle w:val="ListParagraph"/>
+      </w:pPr>
+    </w:p>
+    <w:p>
+      <w:pPr>
+        <w:rPr>
+          <w:sz w:val="28"/>
+          <w:szCs w:val="28"/>
+        </w:rPr>
+      </w:pPr>
+      <w:r>
+        <w:t xml:space="preserve"> </w:t>
+      </w:r>
+      <w:r>
+        <w:rPr>
+          <w:sz w:val="28"/>
+          <w:szCs w:val="28"/>
+        </w:rPr>
         <w:t>I am frustrated with my job. Please help me!!</w:t>
       </w:r>
     </w:p>
     <w:p>
       <w:pPr>
-        <w:pStyle w:val="ListParagraph"/>
-      </w:pPr>
-    </w:p>
-    <w:p>
-      <w:pPr>
-        <w:pStyle w:val="ListParagraph"/>
+        <w:rPr>
+          <w:b/>
+          <w:bCs/>
+          <w:sz w:val="44"/>
+          <w:szCs w:val="44"/>
+        </w:rPr>
+      </w:pPr>
+      <w:r>
+        <w:rPr>
+          <w:b/>
+          <w:bCs/>
+          <w:sz w:val="44"/>
+          <w:szCs w:val="44"/>
+        </w:rPr>
+        <w:t xml:space="preserve">Test6 </w:t>
+      </w:r>
+      <w:r>
+        <w:rPr>
+          <w:b/>
+          <w:bCs/>
+          <w:sz w:val="44"/>
+          <w:szCs w:val="44"/>
+        </w:rPr>
+        <w:t>–</w:t>
+      </w:r>
+      <w:r>
+        <w:rPr>
+          <w:b/>
+          <w:bCs/>
+          <w:sz w:val="44"/>
+          <w:szCs w:val="44"/>
+        </w:rPr>
+        <w:t xml:space="preserve"> </w:t>
+      </w:r>
+      <w:r>
+        <w:rPr>
+          <w:b/>
+          <w:bCs/>
+          <w:sz w:val="44"/>
+          <w:szCs w:val="44"/>
+        </w:rPr>
+        <w:t>Output</w:t>
+      </w:r>
+    </w:p>
+    <w:p>
+      <w:pPr>
+        <w:rPr>
+          <w:sz w:val="28"/>
+          <w:szCs w:val="28"/>
+        </w:rPr>
+      </w:pPr>
+      <w:r>
+        <w:rPr>
+          <w:sz w:val="28"/>
+          <w:szCs w:val="28"/>
+        </w:rPr>
+        <w:t>**Final Score: 1.4/10**</w:t>
+      </w:r>
+    </w:p>
+    <w:p>
+      <w:pPr>
+        <w:rPr>
+          <w:sz w:val="28"/>
+          <w:szCs w:val="28"/>
+        </w:rPr>
+      </w:pPr>
+    </w:p>
+    <w:p>
+      <w:pPr>
+        <w:rPr>
+          <w:sz w:val="28"/>
+          <w:szCs w:val="28"/>
+        </w:rPr>
+      </w:pPr>
+      <w:r>
+        <w:rPr>
+          <w:sz w:val="28"/>
+          <w:szCs w:val="28"/>
+        </w:rPr>
+        <w:t xml:space="preserve">**Scores for each Quality </w:t>
+      </w:r>
+      <w:proofErr w:type="gramStart"/>
+      <w:r>
+        <w:rPr>
+          <w:sz w:val="28"/>
+          <w:szCs w:val="28"/>
+        </w:rPr>
+        <w:t>Criterion:*</w:t>
+      </w:r>
+      <w:proofErr w:type="gramEnd"/>
+      <w:r>
+        <w:rPr>
+          <w:sz w:val="28"/>
+          <w:szCs w:val="28"/>
+        </w:rPr>
+        <w:t>*</w:t>
+      </w:r>
+    </w:p>
+    <w:p>
+      <w:pPr>
+        <w:rPr>
+          <w:sz w:val="28"/>
+          <w:szCs w:val="28"/>
+        </w:rPr>
+      </w:pPr>
+    </w:p>
+    <w:p>
+      <w:pPr>
+        <w:rPr>
+          <w:sz w:val="28"/>
+          <w:szCs w:val="28"/>
+        </w:rPr>
+      </w:pPr>
+      <w:r>
+        <w:rPr>
+          <w:sz w:val="28"/>
+          <w:szCs w:val="28"/>
+        </w:rPr>
+        <w:lastRenderedPageBreak/>
+        <w:t>1.  **Clarity of prompt: 3/10** - The prompt clearly expresses the user's emotional state (frustration) and their desire for help. However, "help me" is a very broad goal, making it unclear what specific kind of assistance is needed.</w:t>
+      </w:r>
+    </w:p>
+    <w:p>
+      <w:pPr>
+        <w:rPr>
+          <w:sz w:val="28"/>
+          <w:szCs w:val="28"/>
+        </w:rPr>
+      </w:pPr>
+      <w:r>
+        <w:rPr>
+          <w:sz w:val="28"/>
+          <w:szCs w:val="28"/>
+        </w:rPr>
+        <w:t>2.  **Specificity/ Details: 1/10** - No details are provided about the job, the reasons for frustration, the user's role, or what kind of "help" would be beneficial.</w:t>
+      </w:r>
+    </w:p>
+    <w:p>
+      <w:pPr>
+        <w:rPr>
+          <w:sz w:val="28"/>
+          <w:szCs w:val="28"/>
+        </w:rPr>
+      </w:pPr>
+      <w:r>
+        <w:rPr>
+          <w:sz w:val="28"/>
+          <w:szCs w:val="28"/>
+        </w:rPr>
+        <w:t>3.  **Context: 1/10** - There is no background information about the job, the industry, the specific problems, or the user's situation.</w:t>
+      </w:r>
+    </w:p>
+    <w:p>
+      <w:pPr>
+        <w:rPr>
+          <w:sz w:val="28"/>
+          <w:szCs w:val="28"/>
+        </w:rPr>
+      </w:pPr>
+      <w:r>
+        <w:rPr>
+          <w:sz w:val="28"/>
+          <w:szCs w:val="28"/>
+        </w:rPr>
+        <w:t>4.  **Output Format and constraints: 0/10** - No expected output format, tone, length, or any other constraints are specified.</w:t>
+      </w:r>
+    </w:p>
+    <w:p>
+      <w:pPr>
+        <w:rPr>
+          <w:sz w:val="28"/>
+          <w:szCs w:val="28"/>
+        </w:rPr>
+      </w:pPr>
+      <w:r>
+        <w:rPr>
+          <w:sz w:val="28"/>
+          <w:szCs w:val="28"/>
+        </w:rPr>
+        <w:t>5.  **Confirm if a prompt assigns a specific role: 0/10** - The prompt does not assign any specific role to the AI (e.g., career counselor, problem-solver, listener).</w:t>
+      </w:r>
+    </w:p>
+    <w:p>
+      <w:pPr>
+        <w:rPr>
+          <w:sz w:val="28"/>
+          <w:szCs w:val="28"/>
+        </w:rPr>
+      </w:pPr>
+    </w:p>
+    <w:p>
+      <w:pPr>
+        <w:rPr>
+          <w:sz w:val="28"/>
+          <w:szCs w:val="28"/>
+        </w:rPr>
+      </w:pPr>
+      <w:r>
+        <w:rPr>
+          <w:sz w:val="28"/>
+          <w:szCs w:val="28"/>
+        </w:rPr>
+        <w:t xml:space="preserve">**Suggestions for improving the </w:t>
+      </w:r>
+      <w:proofErr w:type="gramStart"/>
+      <w:r>
+        <w:rPr>
+          <w:sz w:val="28"/>
+          <w:szCs w:val="28"/>
+        </w:rPr>
+        <w:t>prompt:*</w:t>
+      </w:r>
+      <w:proofErr w:type="gramEnd"/>
+      <w:r>
+        <w:rPr>
+          <w:sz w:val="28"/>
+          <w:szCs w:val="28"/>
+        </w:rPr>
+        <w:t>*</w:t>
+      </w:r>
+    </w:p>
+    <w:p>
+      <w:pPr>
+        <w:rPr>
+          <w:sz w:val="28"/>
+          <w:szCs w:val="28"/>
+        </w:rPr>
+      </w:pPr>
+    </w:p>
+    <w:p>
+      <w:pPr>
+        <w:rPr>
+          <w:sz w:val="28"/>
+          <w:szCs w:val="28"/>
+        </w:rPr>
+      </w:pPr>
+      <w:r>
+        <w:rPr>
+          <w:sz w:val="28"/>
+          <w:szCs w:val="28"/>
+        </w:rPr>
+        <w:t xml:space="preserve">1.  **Provide Specific </w:t>
+      </w:r>
+      <w:proofErr w:type="gramStart"/>
+      <w:r>
+        <w:rPr>
+          <w:sz w:val="28"/>
+          <w:szCs w:val="28"/>
+        </w:rPr>
+        <w:t>Details:*</w:t>
+      </w:r>
+      <w:proofErr w:type="gramEnd"/>
+      <w:r>
+        <w:rPr>
+          <w:sz w:val="28"/>
+          <w:szCs w:val="28"/>
+        </w:rPr>
+        <w:t>* Explain *why* you are frustrated. Is it the workload, the boss, colleagues, lack of growth, low pay, or something else? The more details you provide, the better the AI can understand your situation.</w:t>
+      </w:r>
+    </w:p>
+    <w:p>
+      <w:pPr>
+        <w:rPr>
+          <w:sz w:val="28"/>
+          <w:szCs w:val="28"/>
+        </w:rPr>
+      </w:pPr>
+      <w:r>
+        <w:rPr>
+          <w:sz w:val="28"/>
+          <w:szCs w:val="28"/>
+        </w:rPr>
+        <w:t>2.  **Define "Help</w:t>
+      </w:r>
+      <w:proofErr w:type="gramStart"/>
+      <w:r>
+        <w:rPr>
+          <w:sz w:val="28"/>
+          <w:szCs w:val="28"/>
+        </w:rPr>
+        <w:t>":*</w:t>
+      </w:r>
+      <w:proofErr w:type="gramEnd"/>
+      <w:r>
+        <w:rPr>
+          <w:sz w:val="28"/>
+          <w:szCs w:val="28"/>
+        </w:rPr>
+        <w:t>* Clarify what kind of help you are looking for. Do you want advice on how to cope, suggestions for finding a new job, strategies for improving your current situation, or just a space to vent?</w:t>
+      </w:r>
+    </w:p>
+    <w:p>
+      <w:pPr>
+        <w:rPr>
+          <w:b/>
+          <w:bCs/>
+          <w:sz w:val="28"/>
+          <w:szCs w:val="28"/>
+        </w:rPr>
+      </w:pPr>
+      <w:r>
+        <w:rPr>
+          <w:sz w:val="28"/>
+          <w:szCs w:val="28"/>
+        </w:rPr>
+        <w:t xml:space="preserve">3.  **Assign a Role and Output </w:t>
+      </w:r>
+      <w:proofErr w:type="gramStart"/>
+      <w:r>
+        <w:rPr>
+          <w:sz w:val="28"/>
+          <w:szCs w:val="28"/>
+        </w:rPr>
+        <w:t>Format:*</w:t>
+      </w:r>
+      <w:proofErr w:type="gramEnd"/>
+      <w:r>
+        <w:rPr>
+          <w:sz w:val="28"/>
+          <w:szCs w:val="28"/>
+        </w:rPr>
+        <w:t>* Tell the AI what role you want it to play (e.g., "Act as a career coach," "Provide actionable steps," "Offer empathetic support") and if you have any preferences for the output (e.g., "Give me 3 bullet points of advice," "Write a supportive paragraph").</w:t>
+      </w:r>
+    </w:p>
+    <w:p>
+      <w:pPr>
+        <w:rPr>
+          <w:b/>
+          <w:bCs/>
+          <w:sz w:val="28"/>
+          <w:szCs w:val="28"/>
+        </w:rPr>
+      </w:pPr>
+    </w:p>
+    <w:p>
+      <w:pPr>
+        <w:rPr>
+          <w:b/>
+          <w:bCs/>
+          <w:sz w:val="28"/>
+          <w:szCs w:val="28"/>
+        </w:rPr>
+      </w:pPr>
+    </w:p>
+    <w:p>
+      <w:pPr>
+        <w:pStyle w:val="ListParagraph"/>
+        <w:rPr>
+          <w:sz w:val="28"/>
+          <w:szCs w:val="28"/>
+        </w:rPr>
       </w:pPr>
     </w:p>
     <w:sectPr>

</xml_diff>